<commit_message>
feat: ronda 2 y 3 (mundo tematico, audio por dominio, UI nueva, camara, K.O., controles, props 3D) + evidencias AA3/AA4 y analitica
</commit_message>
<xml_diff>
--- a/Docs/Evidencias/GA5-AA3-EV01_Registro_Cambios.docx
+++ b/Docs/Evidencias/GA5-AA3-EV01_Registro_Cambios.docx
@@ -46,6 +46,17 @@
     <w:p>
       <w:r>
         <w:rPr>
+          <w:b/>
+        </w:rPr>
+        <w:t>Aprendiz:</w:t>
+      </w:r>
+      <w:r>
+        <w:t xml:space="preserve"> Jenifer Daniela Urbano Córdoba · Ficha 3336511</w:t>
+      </w:r>
+    </w:p>
+    <w:p>
+      <w:r>
+        <w:rPr>
           <w:i/>
           <w:color w:val="555555"/>
         </w:rPr>
@@ -58,7 +69,7 @@
           <w:i/>
           <w:color w:val="555555"/>
         </w:rPr>
-        <w:t>funcionalidades, según lo exige la evidencia. El estado **Antes** corresponde al</w:t>
+        <w:t>funcionalidades, como exige la evidencia. Los ajustes responden a los hallazgos</w:t>
       </w:r>
     </w:p>
     <w:p>
@@ -67,7 +78,45 @@
           <w:i/>
           <w:color w:val="555555"/>
         </w:rPr>
-        <w:t>prototipo inicial (mecánicas base en una sola escena) y **Después** al prototipo</w:t>
+        <w:t>del informe AA2 (</w:t>
+      </w:r>
+      <w:r>
+        <w:rPr>
+          <w:b/>
+          <w:i/>
+          <w:color w:val="555555"/>
+        </w:rPr>
+        <w:t>P4</w:t>
+      </w:r>
+      <w:r>
+        <w:rPr>
+          <w:i/>
+          <w:color w:val="555555"/>
+        </w:rPr>
+        <w:t xml:space="preserve"> HUD, </w:t>
+      </w:r>
+      <w:r>
+        <w:rPr>
+          <w:b/>
+          <w:i/>
+          <w:color w:val="555555"/>
+        </w:rPr>
+        <w:t>P6</w:t>
+      </w:r>
+      <w:r>
+        <w:rPr>
+          <w:i/>
+          <w:color w:val="555555"/>
+        </w:rPr>
+        <w:t xml:space="preserve"> retroalimentación de impacto, </w:t>
+      </w:r>
+      <w:r>
+        <w:rPr>
+          <w:b/>
+          <w:i/>
+          <w:color w:val="555555"/>
+        </w:rPr>
+        <w:t>P9</w:t>
       </w:r>
     </w:p>
     <w:p>
@@ -76,7 +125,16 @@
           <w:i/>
           <w:color w:val="555555"/>
         </w:rPr>
-        <w:t>con las 4 escenas, UI Canvas y generación reactiva al audio.</w:t>
+        <w:t>progresión y checkpoints) y a dos defectos detectados al revisar el prototipo</w:t>
+      </w:r>
+    </w:p>
+    <w:p>
+      <w:r>
+        <w:rPr>
+          <w:i/>
+          <w:color w:val="555555"/>
+        </w:rPr>
+        <w:t>(piloto desalineado y bot que caía en cada hueco).</w:t>
       </w:r>
     </w:p>
     <w:p/>
@@ -89,17 +147,233 @@
       </w:r>
     </w:p>
     <w:p>
-      <w:pPr>
-        <w:pStyle w:val="ListNumber"/>
-      </w:pPr>
       <w:r>
-        <w:t xml:space="preserve">Abra </w:t>
+        <w:t xml:space="preserve">Estado del prototipo antes de los ajustes (commit </w:t>
       </w:r>
       <w:r>
         <w:rPr>
-          <w:b/>
+          <w:rFonts w:ascii="Consolas" w:hAnsi="Consolas"/>
         </w:rPr>
-        <w:t>NitroRhythm ▸ Evidence Capture Tool</w:t>
+        <w:t>47f54f3</w:t>
+      </w:r>
+      <w:r>
+        <w:t>):</w:t>
+      </w:r>
+    </w:p>
+    <w:p>
+      <w:r>
+        <w:drawing>
+          <wp:inline xmlns:a="http://schemas.openxmlformats.org/drawingml/2006/main" xmlns:pic="http://schemas.openxmlformats.org/drawingml/2006/picture">
+            <wp:extent cx="5486400" cy="3429000"/>
+            <wp:docPr id="1" name="Picture 1"/>
+            <wp:cNvGraphicFramePr>
+              <a:graphicFrameLocks noChangeAspect="1"/>
+            </wp:cNvGraphicFramePr>
+            <a:graphic>
+              <a:graphicData uri="http://schemas.openxmlformats.org/drawingml/2006/picture">
+                <pic:pic>
+                  <pic:nvPicPr>
+                    <pic:cNvPr id="0" name="02_CharacterSelect_original.png"/>
+                    <pic:cNvPicPr/>
+                  </pic:nvPicPr>
+                  <pic:blipFill>
+                    <a:blip r:embed="rId9"/>
+                    <a:stretch>
+                      <a:fillRect/>
+                    </a:stretch>
+                  </pic:blipFill>
+                  <pic:spPr>
+                    <a:xfrm>
+                      <a:off x="0" y="0"/>
+                      <a:ext cx="5486400" cy="3429000"/>
+                    </a:xfrm>
+                    <a:prstGeom prst="rect"/>
+                  </pic:spPr>
+                </pic:pic>
+              </a:graphicData>
+            </a:graphic>
+          </wp:inline>
+        </w:drawing>
+      </w:r>
+    </w:p>
+    <w:p>
+      <w:r>
+        <w:rPr>
+          <w:i/>
+          <w:sz w:val="18"/>
+        </w:rPr>
+        <w:t>Antes — selección de personajes: el piloto de Lyra queda fuera del kart y el de Karel también</w:t>
+      </w:r>
+    </w:p>
+    <w:p>
+      <w:r>
+        <w:drawing>
+          <wp:inline xmlns:a="http://schemas.openxmlformats.org/drawingml/2006/main" xmlns:pic="http://schemas.openxmlformats.org/drawingml/2006/picture">
+            <wp:extent cx="5486400" cy="3429000"/>
+            <wp:docPr id="2" name="Picture 2"/>
+            <wp:cNvGraphicFramePr>
+              <a:graphicFrameLocks noChangeAspect="1"/>
+            </wp:cNvGraphicFramePr>
+            <a:graphic>
+              <a:graphicData uri="http://schemas.openxmlformats.org/drawingml/2006/picture">
+                <pic:pic>
+                  <pic:nvPicPr>
+                    <pic:cNvPr id="0" name="03_Gameplay_HUD_original.png"/>
+                    <pic:cNvPicPr/>
+                  </pic:nvPicPr>
+                  <pic:blipFill>
+                    <a:blip r:embed="rId10"/>
+                    <a:stretch>
+                      <a:fillRect/>
+                    </a:stretch>
+                  </pic:blipFill>
+                  <pic:spPr>
+                    <a:xfrm>
+                      <a:off x="0" y="0"/>
+                      <a:ext cx="5486400" cy="3429000"/>
+                    </a:xfrm>
+                    <a:prstGeom prst="rect"/>
+                  </pic:spPr>
+                </pic:pic>
+              </a:graphicData>
+            </a:graphic>
+          </wp:inline>
+        </w:drawing>
+      </w:r>
+    </w:p>
+    <w:p>
+      <w:r>
+        <w:rPr>
+          <w:i/>
+          <w:sz w:val="18"/>
+        </w:rPr>
+        <w:t>Antes — HUD original: puntuación, dominio, velocidad y vida solo de P1, sin tiempo ni posición</w:t>
+      </w:r>
+    </w:p>
+    <w:p>
+      <w:r>
+        <w:drawing>
+          <wp:inline xmlns:a="http://schemas.openxmlformats.org/drawingml/2006/main" xmlns:pic="http://schemas.openxmlformats.org/drawingml/2006/picture">
+            <wp:extent cx="5486400" cy="3086100"/>
+            <wp:docPr id="3" name="Picture 3"/>
+            <wp:cNvGraphicFramePr>
+              <a:graphicFrameLocks noChangeAspect="1"/>
+            </wp:cNvGraphicFramePr>
+            <a:graphic>
+              <a:graphicData uri="http://schemas.openxmlformats.org/drawingml/2006/picture">
+                <pic:pic>
+                  <pic:nvPicPr>
+                    <pic:cNvPr id="0" name="lyra_frente.png"/>
+                    <pic:cNvPicPr/>
+                  </pic:nvPicPr>
+                  <pic:blipFill>
+                    <a:blip r:embed="rId11"/>
+                    <a:stretch>
+                      <a:fillRect/>
+                    </a:stretch>
+                  </pic:blipFill>
+                  <pic:spPr>
+                    <a:xfrm>
+                      <a:off x="0" y="0"/>
+                      <a:ext cx="5486400" cy="3086100"/>
+                    </a:xfrm>
+                    <a:prstGeom prst="rect"/>
+                  </pic:spPr>
+                </pic:pic>
+              </a:graphicData>
+            </a:graphic>
+          </wp:inline>
+        </w:drawing>
+      </w:r>
+    </w:p>
+    <w:p>
+      <w:r>
+        <w:rPr>
+          <w:i/>
+          <w:sz w:val="18"/>
+        </w:rPr>
+        <w:t>Antes — vista frontal de Lyra: piloto desplazado a la izquierda del kart</w:t>
+      </w:r>
+    </w:p>
+    <w:p>
+      <w:r>
+        <w:drawing>
+          <wp:inline xmlns:a="http://schemas.openxmlformats.org/drawingml/2006/main" xmlns:pic="http://schemas.openxmlformats.org/drawingml/2006/picture">
+            <wp:extent cx="5486400" cy="3086100"/>
+            <wp:docPr id="4" name="Picture 4"/>
+            <wp:cNvGraphicFramePr>
+              <a:graphicFrameLocks noChangeAspect="1"/>
+            </wp:cNvGraphicFramePr>
+            <a:graphic>
+              <a:graphicData uri="http://schemas.openxmlformats.org/drawingml/2006/picture">
+                <pic:pic>
+                  <pic:nvPicPr>
+                    <pic:cNvPr id="0" name="karel_frente.png"/>
+                    <pic:cNvPicPr/>
+                  </pic:nvPicPr>
+                  <pic:blipFill>
+                    <a:blip r:embed="rId12"/>
+                    <a:stretch>
+                      <a:fillRect/>
+                    </a:stretch>
+                  </pic:blipFill>
+                  <pic:spPr>
+                    <a:xfrm>
+                      <a:off x="0" y="0"/>
+                      <a:ext cx="5486400" cy="3086100"/>
+                    </a:xfrm>
+                    <a:prstGeom prst="rect"/>
+                  </pic:spPr>
+                </pic:pic>
+              </a:graphicData>
+            </a:graphic>
+          </wp:inline>
+        </w:drawing>
+      </w:r>
+    </w:p>
+    <w:p>
+      <w:r>
+        <w:rPr>
+          <w:i/>
+          <w:sz w:val="18"/>
+        </w:rPr>
+        <w:t>Antes — vista frontal de Karel: piloto desplazado a la derecha del kart</w:t>
+      </w:r>
+    </w:p>
+    <w:p>
+      <w:r>
+        <w:t>Las imágenes del piloto se generan con la prueba automática</w:t>
+      </w:r>
+    </w:p>
+    <w:p>
+      <w:r>
+        <w:rPr>
+          <w:rFonts w:ascii="Consolas" w:hAnsi="Consolas"/>
+        </w:rPr>
+        <w:t>CharacterDisplayAlignmentTests</w:t>
+      </w:r>
+      <w:r>
+        <w:t xml:space="preserve"> (carpeta </w:t>
+      </w:r>
+      <w:r>
+        <w:rPr>
+          <w:rFonts w:ascii="Consolas" w:hAnsi="Consolas"/>
+        </w:rPr>
+        <w:t>Assets/Tests/PlayMode/</w:t>
+      </w:r>
+      <w:r>
+        <w:t>), definiendo la</w:t>
+      </w:r>
+    </w:p>
+    <w:p>
+      <w:r>
+        <w:t xml:space="preserve">variable de entorno </w:t>
+      </w:r>
+      <w:r>
+        <w:rPr>
+          <w:rFonts w:ascii="Consolas" w:hAnsi="Consolas"/>
+        </w:rPr>
+        <w:t>NITRO_SHOT_DIR</w:t>
       </w:r>
       <w:r>
         <w:t>.</w:t>
@@ -107,101 +381,10 @@
     </w:p>
     <w:p>
       <w:pPr>
-        <w:pStyle w:val="ListNumber"/>
-      </w:pPr>
-      <w:r>
-        <w:t xml:space="preserve">Carpeta destino: </w:t>
-      </w:r>
-      <w:r>
-        <w:rPr>
-          <w:rFonts w:ascii="Consolas" w:hAnsi="Consolas"/>
-        </w:rPr>
-        <w:t>Antes</w:t>
-      </w:r>
-      <w:r>
-        <w:t>.</w:t>
-      </w:r>
-    </w:p>
-    <w:p>
-      <w:pPr>
-        <w:pStyle w:val="ListNumber"/>
-      </w:pPr>
-      <w:r>
-        <w:t xml:space="preserve">Abra cada escena, entre en </w:t>
-      </w:r>
-      <w:r>
-        <w:rPr>
-          <w:b/>
-        </w:rPr>
-        <w:t>Play</w:t>
-      </w:r>
-      <w:r>
-        <w:t xml:space="preserve"> y capture el Game View:</w:t>
-      </w:r>
-    </w:p>
-    <w:p>
-      <w:r>
-        <w:rPr>
-          <w:rFonts w:ascii="Consolas" w:hAnsi="Consolas"/>
-        </w:rPr>
-        <w:t>00_MainMenu</w:t>
-      </w:r>
-      <w:r>
-        <w:t xml:space="preserve">, </w:t>
-      </w:r>
-      <w:r>
-        <w:rPr>
-          <w:rFonts w:ascii="Consolas" w:hAnsi="Consolas"/>
-        </w:rPr>
-        <w:t>01_CharacterSelect</w:t>
-      </w:r>
-      <w:r>
-        <w:t xml:space="preserve">, </w:t>
-      </w:r>
-      <w:r>
-        <w:rPr>
-          <w:rFonts w:ascii="Consolas" w:hAnsi="Consolas"/>
-        </w:rPr>
-        <w:t>02_Gameplay</w:t>
-      </w:r>
-      <w:r>
-        <w:t xml:space="preserve">, </w:t>
-      </w:r>
-      <w:r>
-        <w:rPr>
-          <w:rFonts w:ascii="Consolas" w:hAnsi="Consolas"/>
-        </w:rPr>
-        <w:t>03_Results</w:t>
-      </w:r>
-      <w:r>
-        <w:t>.</w:t>
-      </w:r>
-    </w:p>
-    <w:p>
-      <w:r>
-        <w:t xml:space="preserve">(En el estado inicial existía una sola escena </w:t>
-      </w:r>
-      <w:r>
-        <w:rPr>
-          <w:rFonts w:ascii="Consolas" w:hAnsi="Consolas"/>
-        </w:rPr>
-        <w:t>SampleScene</w:t>
-      </w:r>
-      <w:r>
-        <w:t xml:space="preserve"> con primitivas;</w:t>
-      </w:r>
-    </w:p>
-    <w:p>
-      <w:r>
-        <w:t>regístrelo como punto de partida.)</w:t>
-      </w:r>
-    </w:p>
-    <w:p>
-      <w:pPr>
         <w:pStyle w:val="Heading2"/>
       </w:pPr>
       <w:r>
-        <w:t>2. Lista ordenada de cambios</w:t>
+        <w:t>2. Lista ordenada de cambios (por importancia y afectación)</w:t>
       </w:r>
     </w:p>
     <w:tbl>
@@ -211,48 +394,94 @@
         <w:tblLook w:firstColumn="1" w:firstRow="1" w:lastColumn="0" w:lastRow="0" w:noHBand="0" w:noVBand="1" w:val="04A0"/>
       </w:tblPr>
       <w:tblGrid>
-        <w:gridCol w:w="2160"/>
-        <w:gridCol w:w="2160"/>
-        <w:gridCol w:w="2160"/>
-        <w:gridCol w:w="2160"/>
+        <w:gridCol w:w="1440"/>
+        <w:gridCol w:w="1440"/>
+        <w:gridCol w:w="1440"/>
+        <w:gridCol w:w="1440"/>
+        <w:gridCol w:w="1440"/>
+        <w:gridCol w:w="1440"/>
       </w:tblGrid>
       <w:tr>
         <w:tc>
           <w:tcPr>
-            <w:tcW w:type="dxa" w:w="2160"/>
+            <w:tcW w:type="dxa" w:w="1440"/>
           </w:tcPr>
           <w:p>
             <w:r>
+              <w:rPr>
+                <w:b/>
+                <w:sz w:val="18"/>
+              </w:rPr>
               <w:t>#</w:t>
             </w:r>
           </w:p>
         </w:tc>
         <w:tc>
           <w:tcPr>
-            <w:tcW w:type="dxa" w:w="2160"/>
+            <w:tcW w:type="dxa" w:w="1440"/>
           </w:tcPr>
           <w:p>
             <w:r>
+              <w:rPr>
+                <w:b/>
+                <w:sz w:val="18"/>
+              </w:rPr>
               <w:t>Prioridad</w:t>
             </w:r>
           </w:p>
         </w:tc>
         <w:tc>
           <w:tcPr>
-            <w:tcW w:type="dxa" w:w="2160"/>
+            <w:tcW w:type="dxa" w:w="1440"/>
           </w:tcPr>
           <w:p>
             <w:r>
-              <w:t>Cambio</w:t>
+              <w:rPr>
+                <w:b/>
+                <w:sz w:val="18"/>
+              </w:rPr>
+              <w:t>Hallazgo / defecto</w:t>
             </w:r>
           </w:p>
         </w:tc>
         <w:tc>
           <w:tcPr>
-            <w:tcW w:type="dxa" w:w="2160"/>
+            <w:tcW w:type="dxa" w:w="1440"/>
           </w:tcPr>
           <w:p>
             <w:r>
+              <w:rPr>
+                <w:b/>
+                <w:sz w:val="18"/>
+              </w:rPr>
+              <w:t>Cambio realizado</w:t>
+            </w:r>
+          </w:p>
+        </w:tc>
+        <w:tc>
+          <w:tcPr>
+            <w:tcW w:type="dxa" w:w="1440"/>
+          </w:tcPr>
+          <w:p>
+            <w:r>
+              <w:rPr>
+                <w:b/>
+                <w:sz w:val="18"/>
+              </w:rPr>
+              <w:t>Archivos principales</w:t>
+            </w:r>
+          </w:p>
+        </w:tc>
+        <w:tc>
+          <w:tcPr>
+            <w:tcW w:type="dxa" w:w="1440"/>
+          </w:tcPr>
+          <w:p>
+            <w:r>
+              <w:rPr>
+                <w:b/>
+                <w:sz w:val="18"/>
+              </w:rPr>
               <w:t>Afectación</w:t>
             </w:r>
           </w:p>
@@ -261,41 +490,132 @@
       <w:tr>
         <w:tc>
           <w:tcPr>
-            <w:tcW w:type="dxa" w:w="2160"/>
+            <w:tcW w:type="dxa" w:w="1440"/>
           </w:tcPr>
           <w:p>
             <w:r>
+              <w:rPr>
+                <w:sz w:val="18"/>
+              </w:rPr>
               <w:t>1</w:t>
             </w:r>
           </w:p>
         </w:tc>
         <w:tc>
           <w:tcPr>
-            <w:tcW w:type="dxa" w:w="2160"/>
+            <w:tcW w:type="dxa" w:w="1440"/>
           </w:tcPr>
           <w:p>
             <w:r>
+              <w:rPr>
+                <w:sz w:val="18"/>
+              </w:rPr>
               <w:t>Alta</w:t>
             </w:r>
           </w:p>
         </w:tc>
         <w:tc>
           <w:tcPr>
-            <w:tcW w:type="dxa" w:w="2160"/>
+            <w:tcW w:type="dxa" w:w="1440"/>
           </w:tcPr>
           <w:p>
             <w:r>
-              <w:t>Separación en **4 escenas** (menú, selección, gameplay, resultados).</w:t>
+              <w:rPr>
+                <w:sz w:val="18"/>
+              </w:rPr>
+              <w:t>Piloto fuera del kart (Lyra −2.13 u, Karel +2.43 u) y sin sentarse en el asiento</w:t>
             </w:r>
           </w:p>
         </w:tc>
         <w:tc>
           <w:tcPr>
-            <w:tcW w:type="dxa" w:w="2160"/>
+            <w:tcW w:type="dxa" w:w="1440"/>
           </w:tcPr>
           <w:p>
             <w:r>
-              <w:t>Estructura y navegación</w:t>
+              <w:rPr>
+                <w:sz w:val="18"/>
+              </w:rPr>
+              <w:t xml:space="preserve">Offset del piloto </w:t>
+            </w:r>
+            <w:r>
+              <w:rPr>
+                <w:b/>
+                <w:sz w:val="18"/>
+              </w:rPr>
+              <w:t>por personaje</w:t>
+            </w:r>
+            <w:r>
+              <w:rPr>
+                <w:sz w:val="18"/>
+              </w:rPr>
+              <w:t xml:space="preserve"> en los datos (</w:t>
+            </w:r>
+            <w:r>
+              <w:rPr>
+                <w:rFonts w:ascii="Consolas" w:hAnsi="Consolas"/>
+                <w:sz w:val="18"/>
+              </w:rPr>
+              <w:t>pilotOffset</w:t>
+            </w:r>
+            <w:r>
+              <w:rPr>
+                <w:sz w:val="18"/>
+              </w:rPr>
+              <w:t>)</w:t>
+            </w:r>
+          </w:p>
+        </w:tc>
+        <w:tc>
+          <w:tcPr>
+            <w:tcW w:type="dxa" w:w="1440"/>
+          </w:tcPr>
+          <w:p>
+            <w:r>
+              <w:rPr>
+                <w:rFonts w:ascii="Consolas" w:hAnsi="Consolas"/>
+                <w:sz w:val="18"/>
+              </w:rPr>
+              <w:t>CharacterDefinition.cs</w:t>
+            </w:r>
+            <w:r>
+              <w:rPr>
+                <w:sz w:val="18"/>
+              </w:rPr>
+              <w:t xml:space="preserve">, </w:t>
+            </w:r>
+            <w:r>
+              <w:rPr>
+                <w:rFonts w:ascii="Consolas" w:hAnsi="Consolas"/>
+                <w:sz w:val="18"/>
+              </w:rPr>
+              <w:t>CharacterDisplay.cs</w:t>
+            </w:r>
+            <w:r>
+              <w:rPr>
+                <w:sz w:val="18"/>
+              </w:rPr>
+              <w:t xml:space="preserve">, </w:t>
+            </w:r>
+            <w:r>
+              <w:rPr>
+                <w:rFonts w:ascii="Consolas" w:hAnsi="Consolas"/>
+                <w:sz w:val="18"/>
+              </w:rPr>
+              <w:t>prototype_data.json</w:t>
+            </w:r>
+          </w:p>
+        </w:tc>
+        <w:tc>
+          <w:tcPr>
+            <w:tcW w:type="dxa" w:w="1440"/>
+          </w:tcPr>
+          <w:p>
+            <w:r>
+              <w:rPr>
+                <w:sz w:val="18"/>
+              </w:rPr>
+              <w:t>Concepto gráfico / interfaces</w:t>
             </w:r>
           </w:p>
         </w:tc>
@@ -303,40 +623,245 @@
       <w:tr>
         <w:tc>
           <w:tcPr>
-            <w:tcW w:type="dxa" w:w="2160"/>
+            <w:tcW w:type="dxa" w:w="1440"/>
           </w:tcPr>
           <w:p>
             <w:r>
+              <w:rPr>
+                <w:sz w:val="18"/>
+              </w:rPr>
               <w:t>2</w:t>
             </w:r>
           </w:p>
         </w:tc>
         <w:tc>
           <w:tcPr>
-            <w:tcW w:type="dxa" w:w="2160"/>
+            <w:tcW w:type="dxa" w:w="1440"/>
           </w:tcPr>
           <w:p>
             <w:r>
+              <w:rPr>
+                <w:sz w:val="18"/>
+              </w:rPr>
               <w:t>Alta</w:t>
             </w:r>
           </w:p>
         </w:tc>
         <w:tc>
           <w:tcPr>
-            <w:tcW w:type="dxa" w:w="2160"/>
+            <w:tcW w:type="dxa" w:w="1440"/>
           </w:tcPr>
           <w:p>
             <w:r>
-              <w:t>**UI Canvas + TextMeshPro** (menú, opciones con sliders, pausa, HUD con velocímetro, barra de progreso y puntuación) en reemplazo de `OnGUI`.</w:t>
+              <w:rPr>
+                <w:sz w:val="18"/>
+              </w:rPr>
+              <w:t>El bot (modo 1 Jugador + Bot) caía al vacío en el primer hueco</w:t>
             </w:r>
           </w:p>
         </w:tc>
         <w:tc>
           <w:tcPr>
-            <w:tcW w:type="dxa" w:w="2160"/>
+            <w:tcW w:type="dxa" w:w="1440"/>
           </w:tcPr>
           <w:p>
             <w:r>
+              <w:rPr>
+                <w:sz w:val="18"/>
+              </w:rPr>
+              <w:t xml:space="preserve">Detección de huecos </w:t>
+            </w:r>
+            <w:r>
+              <w:rPr>
+                <w:b/>
+                <w:sz w:val="18"/>
+              </w:rPr>
+              <w:t>por delante</w:t>
+            </w:r>
+            <w:r>
+              <w:rPr>
+                <w:sz w:val="18"/>
+              </w:rPr>
+              <w:t xml:space="preserve"> del kart y salto en el borde</w:t>
+            </w:r>
+          </w:p>
+        </w:tc>
+        <w:tc>
+          <w:tcPr>
+            <w:tcW w:type="dxa" w:w="1440"/>
+          </w:tcPr>
+          <w:p>
+            <w:r>
+              <w:rPr>
+                <w:rFonts w:ascii="Consolas" w:hAnsi="Consolas"/>
+                <w:sz w:val="18"/>
+              </w:rPr>
+              <w:t>BotKartAI.cs</w:t>
+            </w:r>
+          </w:p>
+        </w:tc>
+        <w:tc>
+          <w:tcPr>
+            <w:tcW w:type="dxa" w:w="1440"/>
+          </w:tcPr>
+          <w:p>
+            <w:r>
+              <w:rPr>
+                <w:sz w:val="18"/>
+              </w:rPr>
+              <w:t>Mecánicas / interactividad</w:t>
+            </w:r>
+          </w:p>
+        </w:tc>
+      </w:tr>
+      <w:tr>
+        <w:tc>
+          <w:tcPr>
+            <w:tcW w:type="dxa" w:w="1440"/>
+          </w:tcPr>
+          <w:p>
+            <w:r>
+              <w:rPr>
+                <w:sz w:val="18"/>
+              </w:rPr>
+              <w:t>3</w:t>
+            </w:r>
+          </w:p>
+        </w:tc>
+        <w:tc>
+          <w:tcPr>
+            <w:tcW w:type="dxa" w:w="1440"/>
+          </w:tcPr>
+          <w:p>
+            <w:r>
+              <w:rPr>
+                <w:sz w:val="18"/>
+              </w:rPr>
+              <w:t>Alta</w:t>
+            </w:r>
+          </w:p>
+        </w:tc>
+        <w:tc>
+          <w:tcPr>
+            <w:tcW w:type="dxa" w:w="1440"/>
+          </w:tcPr>
+          <w:p>
+            <w:r>
+              <w:rPr>
+                <w:b/>
+                <w:sz w:val="18"/>
+              </w:rPr>
+              <w:t>P4</w:t>
+            </w:r>
+            <w:r>
+              <w:rPr>
+                <w:sz w:val="18"/>
+              </w:rPr>
+              <w:t xml:space="preserve"> (3.67): HUD con poca información</w:t>
+            </w:r>
+          </w:p>
+        </w:tc>
+        <w:tc>
+          <w:tcPr>
+            <w:tcW w:type="dxa" w:w="1440"/>
+          </w:tcPr>
+          <w:p>
+            <w:r>
+              <w:rPr>
+                <w:sz w:val="18"/>
+              </w:rPr>
+              <w:t xml:space="preserve">HUD ampliado: </w:t>
+            </w:r>
+            <w:r>
+              <w:rPr>
+                <w:b/>
+                <w:sz w:val="18"/>
+              </w:rPr>
+              <w:t>tiempo</w:t>
+            </w:r>
+            <w:r>
+              <w:rPr>
+                <w:sz w:val="18"/>
+              </w:rPr>
+              <w:t xml:space="preserve">, </w:t>
+            </w:r>
+            <w:r>
+              <w:rPr>
+                <w:b/>
+                <w:sz w:val="18"/>
+              </w:rPr>
+              <w:t>posición en pista</w:t>
+            </w:r>
+            <w:r>
+              <w:rPr>
+                <w:sz w:val="18"/>
+              </w:rPr>
+              <w:t xml:space="preserve">, </w:t>
+            </w:r>
+            <w:r>
+              <w:rPr>
+                <w:b/>
+                <w:sz w:val="18"/>
+              </w:rPr>
+              <w:t>potenciadores</w:t>
+            </w:r>
+            <w:r>
+              <w:rPr>
+                <w:sz w:val="18"/>
+              </w:rPr>
+              <w:t xml:space="preserve"> activos, vida de P1 y P2</w:t>
+            </w:r>
+          </w:p>
+        </w:tc>
+        <w:tc>
+          <w:tcPr>
+            <w:tcW w:type="dxa" w:w="1440"/>
+          </w:tcPr>
+          <w:p>
+            <w:r>
+              <w:rPr>
+                <w:rFonts w:ascii="Consolas" w:hAnsi="Consolas"/>
+                <w:sz w:val="18"/>
+              </w:rPr>
+              <w:t>GameplayHud.cs</w:t>
+            </w:r>
+            <w:r>
+              <w:rPr>
+                <w:sz w:val="18"/>
+              </w:rPr>
+              <w:t xml:space="preserve">, </w:t>
+            </w:r>
+            <w:r>
+              <w:rPr>
+                <w:rFonts w:ascii="Consolas" w:hAnsi="Consolas"/>
+                <w:sz w:val="18"/>
+              </w:rPr>
+              <w:t>PlayerKartController.cs</w:t>
+            </w:r>
+            <w:r>
+              <w:rPr>
+                <w:sz w:val="18"/>
+              </w:rPr>
+              <w:t xml:space="preserve">, </w:t>
+            </w:r>
+            <w:r>
+              <w:rPr>
+                <w:rFonts w:ascii="Consolas" w:hAnsi="Consolas"/>
+                <w:sz w:val="18"/>
+              </w:rPr>
+              <w:t>KartHealthSpeed.cs</w:t>
+            </w:r>
+          </w:p>
+        </w:tc>
+        <w:tc>
+          <w:tcPr>
+            <w:tcW w:type="dxa" w:w="1440"/>
+          </w:tcPr>
+          <w:p>
+            <w:r>
+              <w:rPr>
+                <w:sz w:val="18"/>
+              </w:rPr>
               <w:t>Interfaces</w:t>
             </w:r>
           </w:p>
@@ -345,41 +870,87 @@
       <w:tr>
         <w:tc>
           <w:tcPr>
-            <w:tcW w:type="dxa" w:w="2160"/>
+            <w:tcW w:type="dxa" w:w="1440"/>
           </w:tcPr>
           <w:p>
             <w:r>
-              <w:t>3</w:t>
+              <w:rPr>
+                <w:sz w:val="18"/>
+              </w:rPr>
+              <w:t>4</w:t>
             </w:r>
           </w:p>
         </w:tc>
         <w:tc>
           <w:tcPr>
-            <w:tcW w:type="dxa" w:w="2160"/>
+            <w:tcW w:type="dxa" w:w="1440"/>
           </w:tcPr>
           <w:p>
             <w:r>
+              <w:rPr>
+                <w:sz w:val="18"/>
+              </w:rPr>
               <w:t>Alta</w:t>
             </w:r>
           </w:p>
         </w:tc>
         <w:tc>
           <w:tcPr>
-            <w:tcW w:type="dxa" w:w="2160"/>
+            <w:tcW w:type="dxa" w:w="1440"/>
           </w:tcPr>
           <w:p>
             <w:r>
-              <w:t>**Generación de pistas reactiva al audio** (FFT + BPM): graves → huecos/saltos, agudos → obstáculos, BPM → velocidad y cadencia de disparo.</w:t>
+              <w:rPr>
+                <w:b/>
+                <w:sz w:val="18"/>
+              </w:rPr>
+              <w:t>P9</w:t>
+            </w:r>
+            <w:r>
+              <w:rPr>
+                <w:sz w:val="18"/>
+              </w:rPr>
+              <w:t xml:space="preserve"> (3.67): dificultad pronunciada al inicio</w:t>
             </w:r>
           </w:p>
         </w:tc>
         <w:tc>
           <w:tcPr>
-            <w:tcW w:type="dxa" w:w="2160"/>
+            <w:tcW w:type="dxa" w:w="1440"/>
           </w:tcPr>
           <w:p>
             <w:r>
-              <w:t>Mecánicas y concepto gráfico</w:t>
+              <w:rPr>
+                <w:sz w:val="18"/>
+              </w:rPr>
+              <w:t>Curva suavizada: huecos −40 % y menos peligros en los primeros dominios, tramo seguro inicial</w:t>
+            </w:r>
+          </w:p>
+        </w:tc>
+        <w:tc>
+          <w:tcPr>
+            <w:tcW w:type="dxa" w:w="1440"/>
+          </w:tcPr>
+          <w:p>
+            <w:r>
+              <w:rPr>
+                <w:rFonts w:ascii="Consolas" w:hAnsi="Consolas"/>
+                <w:sz w:val="18"/>
+              </w:rPr>
+              <w:t>ProceduralTrackBuilder.cs</w:t>
+            </w:r>
+          </w:p>
+        </w:tc>
+        <w:tc>
+          <w:tcPr>
+            <w:tcW w:type="dxa" w:w="1440"/>
+          </w:tcPr>
+          <w:p>
+            <w:r>
+              <w:rPr>
+                <w:sz w:val="18"/>
+              </w:rPr>
+              <w:t>Niveles / mecánicas</w:t>
             </w:r>
           </w:p>
         </w:tc>
@@ -387,41 +958,126 @@
       <w:tr>
         <w:tc>
           <w:tcPr>
-            <w:tcW w:type="dxa" w:w="2160"/>
+            <w:tcW w:type="dxa" w:w="1440"/>
           </w:tcPr>
           <w:p>
             <w:r>
-              <w:t>4</w:t>
+              <w:rPr>
+                <w:sz w:val="18"/>
+              </w:rPr>
+              <w:t>5</w:t>
             </w:r>
           </w:p>
         </w:tc>
         <w:tc>
           <w:tcPr>
-            <w:tcW w:type="dxa" w:w="2160"/>
+            <w:tcW w:type="dxa" w:w="1440"/>
           </w:tcPr>
           <w:p>
             <w:r>
+              <w:rPr>
+                <w:sz w:val="18"/>
+              </w:rPr>
               <w:t>Alta</w:t>
             </w:r>
           </w:p>
         </w:tc>
         <w:tc>
           <w:tcPr>
-            <w:tcW w:type="dxa" w:w="2160"/>
+            <w:tcW w:type="dxa" w:w="1440"/>
           </w:tcPr>
           <w:p>
             <w:r>
-              <w:t>**Modos de juego completos** (1P, 1P+Bot, Coop 2P, Showdown 3P) con viewports exactos.</w:t>
+              <w:rPr>
+                <w:b/>
+                <w:sz w:val="18"/>
+              </w:rPr>
+              <w:t>P9</w:t>
+            </w:r>
+            <w:r>
+              <w:rPr>
+                <w:sz w:val="18"/>
+              </w:rPr>
+              <w:t>: checkpoints poco visibles</w:t>
             </w:r>
           </w:p>
         </w:tc>
         <w:tc>
           <w:tcPr>
-            <w:tcW w:type="dxa" w:w="2160"/>
+            <w:tcW w:type="dxa" w:w="1440"/>
           </w:tcPr>
           <w:p>
             <w:r>
-              <w:t>Mecánicas</w:t>
+              <w:rPr>
+                <w:sz w:val="18"/>
+              </w:rPr>
+              <w:t xml:space="preserve">Arco neón </w:t>
+            </w:r>
+            <w:r>
+              <w:rPr>
+                <w:b/>
+                <w:sz w:val="18"/>
+              </w:rPr>
+              <w:t>ámbar → verde</w:t>
+            </w:r>
+            <w:r>
+              <w:rPr>
+                <w:sz w:val="18"/>
+              </w:rPr>
+              <w:t xml:space="preserve"> al activarse, aviso "CHECKPOINT", sonido y más frecuentes en dominios 1–2</w:t>
+            </w:r>
+          </w:p>
+        </w:tc>
+        <w:tc>
+          <w:tcPr>
+            <w:tcW w:type="dxa" w:w="1440"/>
+          </w:tcPr>
+          <w:p>
+            <w:r>
+              <w:rPr>
+                <w:rFonts w:ascii="Consolas" w:hAnsi="Consolas"/>
+                <w:sz w:val="18"/>
+              </w:rPr>
+              <w:t>CheckpointComponent.cs</w:t>
+            </w:r>
+            <w:r>
+              <w:rPr>
+                <w:sz w:val="18"/>
+              </w:rPr>
+              <w:t xml:space="preserve">, </w:t>
+            </w:r>
+            <w:r>
+              <w:rPr>
+                <w:rFonts w:ascii="Consolas" w:hAnsi="Consolas"/>
+                <w:sz w:val="18"/>
+              </w:rPr>
+              <w:t>LevelManager.cs</w:t>
+            </w:r>
+            <w:r>
+              <w:rPr>
+                <w:sz w:val="18"/>
+              </w:rPr>
+              <w:t xml:space="preserve">, </w:t>
+            </w:r>
+            <w:r>
+              <w:rPr>
+                <w:rFonts w:ascii="Consolas" w:hAnsi="Consolas"/>
+                <w:sz w:val="18"/>
+              </w:rPr>
+              <w:t>GameplayHud.cs</w:t>
+            </w:r>
+          </w:p>
+        </w:tc>
+        <w:tc>
+          <w:tcPr>
+            <w:tcW w:type="dxa" w:w="1440"/>
+          </w:tcPr>
+          <w:p>
+            <w:r>
+              <w:rPr>
+                <w:sz w:val="18"/>
+              </w:rPr>
+              <w:t>Niveles / interfaces</w:t>
             </w:r>
           </w:p>
         </w:tc>
@@ -429,41 +1085,133 @@
       <w:tr>
         <w:tc>
           <w:tcPr>
-            <w:tcW w:type="dxa" w:w="2160"/>
+            <w:tcW w:type="dxa" w:w="1440"/>
           </w:tcPr>
           <w:p>
             <w:r>
-              <w:t>5</w:t>
+              <w:rPr>
+                <w:sz w:val="18"/>
+              </w:rPr>
+              <w:t>6</w:t>
             </w:r>
           </w:p>
         </w:tc>
         <w:tc>
           <w:tcPr>
-            <w:tcW w:type="dxa" w:w="2160"/>
+            <w:tcW w:type="dxa" w:w="1440"/>
           </w:tcPr>
           <w:p>
             <w:r>
-              <w:t>Media</w:t>
+              <w:rPr>
+                <w:sz w:val="18"/>
+              </w:rPr>
+              <w:t>Alta</w:t>
             </w:r>
           </w:p>
         </w:tc>
         <w:tc>
           <w:tcPr>
-            <w:tcW w:type="dxa" w:w="2160"/>
+            <w:tcW w:type="dxa" w:w="1440"/>
           </w:tcPr>
           <w:p>
             <w:r>
-              <w:t>**Sistema narrativo data-driven** (`DialogueSystem` + `CutsceneController`) leyendo `prototype_data.json`; 10 dominios musicales y retratos.</w:t>
+              <w:rPr>
+                <w:b/>
+                <w:sz w:val="18"/>
+              </w:rPr>
+              <w:t>P6</w:t>
+            </w:r>
+            <w:r>
+              <w:rPr>
+                <w:sz w:val="18"/>
+              </w:rPr>
+              <w:t xml:space="preserve"> (4.00): poco aviso al recibir un proyectil</w:t>
             </w:r>
           </w:p>
         </w:tc>
         <w:tc>
           <w:tcPr>
-            <w:tcW w:type="dxa" w:w="2160"/>
+            <w:tcW w:type="dxa" w:w="1440"/>
           </w:tcPr>
           <w:p>
             <w:r>
-              <w:t>Niveles y concepto gráfico</w:t>
+              <w:rPr>
+                <w:sz w:val="18"/>
+              </w:rPr>
+              <w:t xml:space="preserve">Sacudida de cámara, destello rojo más fuerte, aviso "IMPACTO! −15 VIDA", parpadeo de la vida y </w:t>
+            </w:r>
+            <w:r>
+              <w:rPr>
+                <w:b/>
+                <w:sz w:val="18"/>
+              </w:rPr>
+              <w:t>sonido de impacto</w:t>
+            </w:r>
+          </w:p>
+        </w:tc>
+        <w:tc>
+          <w:tcPr>
+            <w:tcW w:type="dxa" w:w="1440"/>
+          </w:tcPr>
+          <w:p>
+            <w:r>
+              <w:rPr>
+                <w:rFonts w:ascii="Consolas" w:hAnsi="Consolas"/>
+                <w:sz w:val="18"/>
+              </w:rPr>
+              <w:t>KartHealthSpeed.cs</w:t>
+            </w:r>
+            <w:r>
+              <w:rPr>
+                <w:sz w:val="18"/>
+              </w:rPr>
+              <w:t xml:space="preserve">, </w:t>
+            </w:r>
+            <w:r>
+              <w:rPr>
+                <w:rFonts w:ascii="Consolas" w:hAnsi="Consolas"/>
+                <w:sz w:val="18"/>
+              </w:rPr>
+              <w:t>CameraFollow.cs</w:t>
+            </w:r>
+            <w:r>
+              <w:rPr>
+                <w:sz w:val="18"/>
+              </w:rPr>
+              <w:t xml:space="preserve">, </w:t>
+            </w:r>
+            <w:r>
+              <w:rPr>
+                <w:rFonts w:ascii="Consolas" w:hAnsi="Consolas"/>
+                <w:sz w:val="18"/>
+              </w:rPr>
+              <w:t>GameplayHud.cs</w:t>
+            </w:r>
+            <w:r>
+              <w:rPr>
+                <w:sz w:val="18"/>
+              </w:rPr>
+              <w:t xml:space="preserve">, </w:t>
+            </w:r>
+            <w:r>
+              <w:rPr>
+                <w:rFonts w:ascii="Consolas" w:hAnsi="Consolas"/>
+                <w:sz w:val="18"/>
+              </w:rPr>
+              <w:t>SfxLibrary.cs</w:t>
+            </w:r>
+          </w:p>
+        </w:tc>
+        <w:tc>
+          <w:tcPr>
+            <w:tcW w:type="dxa" w:w="1440"/>
+          </w:tcPr>
+          <w:p>
+            <w:r>
+              <w:rPr>
+                <w:sz w:val="18"/>
+              </w:rPr>
+              <w:t>Interactividad / audio</w:t>
             </w:r>
           </w:p>
         </w:tc>
@@ -471,41 +1219,126 @@
       <w:tr>
         <w:tc>
           <w:tcPr>
-            <w:tcW w:type="dxa" w:w="2160"/>
+            <w:tcW w:type="dxa" w:w="1440"/>
           </w:tcPr>
           <w:p>
             <w:r>
-              <w:t>6</w:t>
+              <w:rPr>
+                <w:sz w:val="18"/>
+              </w:rPr>
+              <w:t>7</w:t>
             </w:r>
           </w:p>
         </w:tc>
         <w:tc>
           <w:tcPr>
-            <w:tcW w:type="dxa" w:w="2160"/>
+            <w:tcW w:type="dxa" w:w="1440"/>
           </w:tcPr>
           <w:p>
             <w:r>
+              <w:rPr>
+                <w:sz w:val="18"/>
+              </w:rPr>
               <w:t>Media</w:t>
             </w:r>
           </w:p>
         </w:tc>
         <w:tc>
           <w:tcPr>
-            <w:tcW w:type="dxa" w:w="2160"/>
+            <w:tcW w:type="dxa" w:w="1440"/>
           </w:tcPr>
           <w:p>
             <w:r>
-              <w:t>**Checkpoints intermedios** y reaparición conservando el impulso.</w:t>
+              <w:rPr>
+                <w:sz w:val="18"/>
+              </w:rPr>
+              <w:t>Solo había música, sin efectos</w:t>
             </w:r>
           </w:p>
         </w:tc>
         <w:tc>
           <w:tcPr>
-            <w:tcW w:type="dxa" w:w="2160"/>
+            <w:tcW w:type="dxa" w:w="1440"/>
           </w:tcPr>
           <w:p>
             <w:r>
-              <w:t>Niveles / interactividad</w:t>
+              <w:rPr>
+                <w:b/>
+                <w:sz w:val="18"/>
+              </w:rPr>
+              <w:t>SFX procedurales</w:t>
+            </w:r>
+            <w:r>
+              <w:rPr>
+                <w:sz w:val="18"/>
+              </w:rPr>
+              <w:t xml:space="preserve">: salto, turbo, checkpoint, disparo del villano, meta, hover de botones y </w:t>
+            </w:r>
+            <w:r>
+              <w:rPr>
+                <w:b/>
+                <w:sz w:val="18"/>
+              </w:rPr>
+              <w:t>motor</w:t>
+            </w:r>
+            <w:r>
+              <w:rPr>
+                <w:sz w:val="18"/>
+              </w:rPr>
+              <w:t xml:space="preserve"> con tono según velocidad</w:t>
+            </w:r>
+          </w:p>
+        </w:tc>
+        <w:tc>
+          <w:tcPr>
+            <w:tcW w:type="dxa" w:w="1440"/>
+          </w:tcPr>
+          <w:p>
+            <w:r>
+              <w:rPr>
+                <w:rFonts w:ascii="Consolas" w:hAnsi="Consolas"/>
+                <w:sz w:val="18"/>
+              </w:rPr>
+              <w:t>SfxLibrary.cs</w:t>
+            </w:r>
+            <w:r>
+              <w:rPr>
+                <w:sz w:val="18"/>
+              </w:rPr>
+              <w:t xml:space="preserve">, </w:t>
+            </w:r>
+            <w:r>
+              <w:rPr>
+                <w:rFonts w:ascii="Consolas" w:hAnsi="Consolas"/>
+                <w:sz w:val="18"/>
+              </w:rPr>
+              <w:t>SfxPlayer.cs</w:t>
+            </w:r>
+            <w:r>
+              <w:rPr>
+                <w:sz w:val="18"/>
+              </w:rPr>
+              <w:t xml:space="preserve">, </w:t>
+            </w:r>
+            <w:r>
+              <w:rPr>
+                <w:rFonts w:ascii="Consolas" w:hAnsi="Consolas"/>
+                <w:sz w:val="18"/>
+              </w:rPr>
+              <w:t>EngineSound.cs</w:t>
+            </w:r>
+          </w:p>
+        </w:tc>
+        <w:tc>
+          <w:tcPr>
+            <w:tcW w:type="dxa" w:w="1440"/>
+          </w:tcPr>
+          <w:p>
+            <w:r>
+              <w:rPr>
+                <w:sz w:val="18"/>
+              </w:rPr>
+              <w:t>Concepto gráfico (audio)</w:t>
             </w:r>
           </w:p>
         </w:tc>
@@ -513,167 +1346,100 @@
       <w:tr>
         <w:tc>
           <w:tcPr>
-            <w:tcW w:type="dxa" w:w="2160"/>
+            <w:tcW w:type="dxa" w:w="1440"/>
           </w:tcPr>
           <w:p>
             <w:r>
-              <w:t>7</w:t>
-            </w:r>
-          </w:p>
-        </w:tc>
-        <w:tc>
-          <w:tcPr>
-            <w:tcW w:type="dxa" w:w="2160"/>
-          </w:tcPr>
-          <w:p>
-            <w:r>
-              <w:t>Media</w:t>
-            </w:r>
-          </w:p>
-        </w:tc>
-        <w:tc>
-          <w:tcPr>
-            <w:tcW w:type="dxa" w:w="2160"/>
-          </w:tcPr>
-          <w:p>
-            <w:r>
-              <w:t>**Abstracción de entrada** (`IInputProvider`) desacoplada de la física; bot reescrito.</w:t>
-            </w:r>
-          </w:p>
-        </w:tc>
-        <w:tc>
-          <w:tcPr>
-            <w:tcW w:type="dxa" w:w="2160"/>
-          </w:tcPr>
-          <w:p>
-            <w:r>
-              <w:t>Interactividad</w:t>
-            </w:r>
-          </w:p>
-        </w:tc>
-      </w:tr>
-      <w:tr>
-        <w:tc>
-          <w:tcPr>
-            <w:tcW w:type="dxa" w:w="2160"/>
-          </w:tcPr>
-          <w:p>
-            <w:r>
+              <w:rPr>
+                <w:sz w:val="18"/>
+              </w:rPr>
               <w:t>8</w:t>
             </w:r>
           </w:p>
         </w:tc>
         <w:tc>
           <w:tcPr>
-            <w:tcW w:type="dxa" w:w="2160"/>
+            <w:tcW w:type="dxa" w:w="1440"/>
           </w:tcPr>
           <w:p>
             <w:r>
-              <w:t>Media</w:t>
-            </w:r>
-          </w:p>
-        </w:tc>
-        <w:tc>
-          <w:tcPr>
-            <w:tcW w:type="dxa" w:w="2160"/>
-          </w:tcPr>
-          <w:p>
-            <w:r>
-              <w:t>**Villano**: `FiringPoint` modular, proyectil parabólico corregido (`Lerp`+`Sin`), daño de proximidad.</w:t>
-            </w:r>
-          </w:p>
-        </w:tc>
-        <w:tc>
-          <w:tcPr>
-            <w:tcW w:type="dxa" w:w="2160"/>
-          </w:tcPr>
-          <w:p>
-            <w:r>
-              <w:t>Mecánicas</w:t>
-            </w:r>
-          </w:p>
-        </w:tc>
-      </w:tr>
-      <w:tr>
-        <w:tc>
-          <w:tcPr>
-            <w:tcW w:type="dxa" w:w="2160"/>
-          </w:tcPr>
-          <w:p>
-            <w:r>
-              <w:t>9</w:t>
-            </w:r>
-          </w:p>
-        </w:tc>
-        <w:tc>
-          <w:tcPr>
-            <w:tcW w:type="dxa" w:w="2160"/>
-          </w:tcPr>
-          <w:p>
-            <w:r>
-              <w:t>Media</w:t>
-            </w:r>
-          </w:p>
-        </w:tc>
-        <w:tc>
-          <w:tcPr>
-            <w:tcW w:type="dxa" w:w="2160"/>
-          </w:tcPr>
-          <w:p>
-            <w:r>
-              <w:t>**Modelos 3D** generados en Blender (Kart_Neon_01..03, pilotos, PremioMalo) con materiales URP y anclajes.</w:t>
-            </w:r>
-          </w:p>
-        </w:tc>
-        <w:tc>
-          <w:tcPr>
-            <w:tcW w:type="dxa" w:w="2160"/>
-          </w:tcPr>
-          <w:p>
-            <w:r>
-              <w:t>Concepto gráfico</w:t>
-            </w:r>
-          </w:p>
-        </w:tc>
-      </w:tr>
-      <w:tr>
-        <w:tc>
-          <w:tcPr>
-            <w:tcW w:type="dxa" w:w="2160"/>
-          </w:tcPr>
-          <w:p>
-            <w:r>
-              <w:t>10</w:t>
-            </w:r>
-          </w:p>
-        </w:tc>
-        <w:tc>
-          <w:tcPr>
-            <w:tcW w:type="dxa" w:w="2160"/>
-          </w:tcPr>
-          <w:p>
-            <w:r>
+              <w:rPr>
+                <w:sz w:val="18"/>
+              </w:rPr>
               <w:t>Baja</w:t>
             </w:r>
           </w:p>
         </w:tc>
         <w:tc>
           <w:tcPr>
-            <w:tcW w:type="dxa" w:w="2160"/>
+            <w:tcW w:type="dxa" w:w="1440"/>
           </w:tcPr>
           <w:p>
             <w:r>
-              <w:t>**Temas de color por dominio** desde el concept art (Conservatorio → Harmonya).</w:t>
+              <w:rPr>
+                <w:sz w:val="18"/>
+              </w:rPr>
+              <w:t>Resultados sin tiempo de carrera</w:t>
             </w:r>
           </w:p>
         </w:tc>
         <w:tc>
           <w:tcPr>
-            <w:tcW w:type="dxa" w:w="2160"/>
+            <w:tcW w:type="dxa" w:w="1440"/>
           </w:tcPr>
           <w:p>
             <w:r>
-              <w:t>Niveles / concepto gráfico</w:t>
+              <w:rPr>
+                <w:sz w:val="18"/>
+              </w:rPr>
+              <w:t xml:space="preserve">La pantalla de resultados muestra el </w:t>
+            </w:r>
+            <w:r>
+              <w:rPr>
+                <w:b/>
+                <w:sz w:val="18"/>
+              </w:rPr>
+              <w:t>tiempo total</w:t>
+            </w:r>
+          </w:p>
+        </w:tc>
+        <w:tc>
+          <w:tcPr>
+            <w:tcW w:type="dxa" w:w="1440"/>
+          </w:tcPr>
+          <w:p>
+            <w:r>
+              <w:rPr>
+                <w:rFonts w:ascii="Consolas" w:hAnsi="Consolas"/>
+                <w:sz w:val="18"/>
+              </w:rPr>
+              <w:t>GameSession.cs</w:t>
+            </w:r>
+            <w:r>
+              <w:rPr>
+                <w:sz w:val="18"/>
+              </w:rPr>
+              <w:t xml:space="preserve">, </w:t>
+            </w:r>
+            <w:r>
+              <w:rPr>
+                <w:rFonts w:ascii="Consolas" w:hAnsi="Consolas"/>
+                <w:sz w:val="18"/>
+              </w:rPr>
+              <w:t>ResultsScreen.cs</w:t>
+            </w:r>
+          </w:p>
+        </w:tc>
+        <w:tc>
+          <w:tcPr>
+            <w:tcW w:type="dxa" w:w="1440"/>
+          </w:tcPr>
+          <w:p>
+            <w:r>
+              <w:rPr>
+                <w:sz w:val="18"/>
+              </w:rPr>
+              <w:t>Interfaces</w:t>
             </w:r>
           </w:p>
         </w:tc>
@@ -684,12 +1450,1316 @@
         <w:pStyle w:val="Heading2"/>
       </w:pPr>
       <w:r>
-        <w:t>3. Implementación en Modo Editor</w:t>
+        <w:t>3. Detalle de cada ajuste</w:t>
+      </w:r>
+    </w:p>
+    <w:p>
+      <w:pPr>
+        <w:pStyle w:val="Heading3"/>
+      </w:pPr>
+      <w:r>
+        <w:t>3.1 Piloto alineado y sentado (defecto #1)</w:t>
       </w:r>
     </w:p>
     <w:p>
       <w:r>
-        <w:t xml:space="preserve">Cada cambio se implementó en los scripts de </w:t>
+        <w:t>Cada FBX se exportó con un origen distinto, por lo que el mismo desplazamiento</w:t>
+      </w:r>
+    </w:p>
+    <w:p>
+      <w:r>
+        <w:t xml:space="preserve">fijo </w:t>
+      </w:r>
+      <w:r>
+        <w:rPr>
+          <w:rFonts w:ascii="Consolas" w:hAnsi="Consolas"/>
+        </w:rPr>
+        <w:t>(0, 0.45, 0)</w:t>
+      </w:r>
+      <w:r>
+        <w:t xml:space="preserve"> funcionaba solo para Vox. Se midió la posición real de cada</w:t>
+      </w:r>
+    </w:p>
+    <w:p>
+      <w:r>
+        <w:t>piloto respecto de su kart con una prueba en PlayMode y se movió el offset a los</w:t>
+      </w:r>
+    </w:p>
+    <w:p>
+      <w:r>
+        <w:t>datos (</w:t>
+      </w:r>
+      <w:r>
+        <w:rPr>
+          <w:rFonts w:ascii="Consolas" w:hAnsi="Consolas"/>
+        </w:rPr>
+        <w:t>prototype_data.json</w:t>
+      </w:r>
+      <w:r>
+        <w:t>), editable sin recompilar.</w:t>
+      </w:r>
+    </w:p>
+    <w:tbl>
+      <w:tblPr>
+        <w:tblStyle w:val="LightGrid-Accent1"/>
+        <w:tblW w:type="auto" w:w="0"/>
+        <w:tblLook w:firstColumn="1" w:firstRow="1" w:lastColumn="0" w:lastRow="0" w:noHBand="0" w:noVBand="1" w:val="04A0"/>
+      </w:tblPr>
+      <w:tblGrid>
+        <w:gridCol w:w="2880"/>
+        <w:gridCol w:w="2880"/>
+        <w:gridCol w:w="2880"/>
+      </w:tblGrid>
+      <w:tr>
+        <w:tc>
+          <w:tcPr>
+            <w:tcW w:type="dxa" w:w="2880"/>
+          </w:tcPr>
+          <w:p>
+            <w:r>
+              <w:rPr>
+                <w:b/>
+                <w:sz w:val="18"/>
+              </w:rPr>
+              <w:t>Personaje</w:t>
+            </w:r>
+          </w:p>
+        </w:tc>
+        <w:tc>
+          <w:tcPr>
+            <w:tcW w:type="dxa" w:w="2880"/>
+          </w:tcPr>
+          <w:p>
+            <w:r>
+              <w:rPr>
+                <w:b/>
+                <w:sz w:val="18"/>
+              </w:rPr>
+              <w:t>Desfase lateral medido (antes)</w:t>
+            </w:r>
+          </w:p>
+        </w:tc>
+        <w:tc>
+          <w:tcPr>
+            <w:tcW w:type="dxa" w:w="2880"/>
+          </w:tcPr>
+          <w:p>
+            <w:r>
+              <w:rPr>
+                <w:rFonts w:ascii="Consolas" w:hAnsi="Consolas"/>
+                <w:b/>
+                <w:sz w:val="18"/>
+              </w:rPr>
+              <w:t>pilotOffset</w:t>
+            </w:r>
+            <w:r>
+              <w:rPr>
+                <w:b/>
+                <w:sz w:val="18"/>
+              </w:rPr>
+              <w:t xml:space="preserve"> aplicado (x, y, z)</w:t>
+            </w:r>
+          </w:p>
+        </w:tc>
+      </w:tr>
+      <w:tr>
+        <w:tc>
+          <w:tcPr>
+            <w:tcW w:type="dxa" w:w="2880"/>
+          </w:tcPr>
+          <w:p>
+            <w:r>
+              <w:rPr>
+                <w:sz w:val="18"/>
+              </w:rPr>
+              <w:t>Lyra</w:t>
+            </w:r>
+          </w:p>
+        </w:tc>
+        <w:tc>
+          <w:tcPr>
+            <w:tcW w:type="dxa" w:w="2880"/>
+          </w:tcPr>
+          <w:p>
+            <w:r>
+              <w:rPr>
+                <w:sz w:val="18"/>
+              </w:rPr>
+              <w:t>−2.13 u</w:t>
+            </w:r>
+          </w:p>
+        </w:tc>
+        <w:tc>
+          <w:tcPr>
+            <w:tcW w:type="dxa" w:w="2880"/>
+          </w:tcPr>
+          <w:p>
+            <w:r>
+              <w:rPr>
+                <w:sz w:val="18"/>
+              </w:rPr>
+              <w:t>(2.07, 0.62, 0.23)</w:t>
+            </w:r>
+          </w:p>
+        </w:tc>
+      </w:tr>
+      <w:tr>
+        <w:tc>
+          <w:tcPr>
+            <w:tcW w:type="dxa" w:w="2880"/>
+          </w:tcPr>
+          <w:p>
+            <w:r>
+              <w:rPr>
+                <w:sz w:val="18"/>
+              </w:rPr>
+              <w:t>Karel</w:t>
+            </w:r>
+          </w:p>
+        </w:tc>
+        <w:tc>
+          <w:tcPr>
+            <w:tcW w:type="dxa" w:w="2880"/>
+          </w:tcPr>
+          <w:p>
+            <w:r>
+              <w:rPr>
+                <w:sz w:val="18"/>
+              </w:rPr>
+              <w:t>+2.43 u</w:t>
+            </w:r>
+          </w:p>
+        </w:tc>
+        <w:tc>
+          <w:tcPr>
+            <w:tcW w:type="dxa" w:w="2880"/>
+          </w:tcPr>
+          <w:p>
+            <w:r>
+              <w:rPr>
+                <w:sz w:val="18"/>
+              </w:rPr>
+              <w:t>(−2.49, 0.37, 0.58)</w:t>
+            </w:r>
+          </w:p>
+        </w:tc>
+      </w:tr>
+      <w:tr>
+        <w:tc>
+          <w:tcPr>
+            <w:tcW w:type="dxa" w:w="2880"/>
+          </w:tcPr>
+          <w:p>
+            <w:r>
+              <w:rPr>
+                <w:sz w:val="18"/>
+              </w:rPr>
+              <w:t>Vox</w:t>
+            </w:r>
+          </w:p>
+        </w:tc>
+        <w:tc>
+          <w:tcPr>
+            <w:tcW w:type="dxa" w:w="2880"/>
+          </w:tcPr>
+          <w:p>
+            <w:r>
+              <w:rPr>
+                <w:sz w:val="18"/>
+              </w:rPr>
+              <w:t>−0.06 u</w:t>
+            </w:r>
+          </w:p>
+        </w:tc>
+        <w:tc>
+          <w:tcPr>
+            <w:tcW w:type="dxa" w:w="2880"/>
+          </w:tcPr>
+          <w:p>
+            <w:r>
+              <w:rPr>
+                <w:sz w:val="18"/>
+              </w:rPr>
+              <w:t>(0.00, 0.45, 0.90)</w:t>
+            </w:r>
+          </w:p>
+        </w:tc>
+      </w:tr>
+    </w:tbl>
+    <w:p>
+      <w:r>
+        <w:t>Además, las vistas laterales mostraron que incluso Vox flotaba sobre el morro; el</w:t>
+      </w:r>
+    </w:p>
+    <w:p>
+      <w:r>
+        <w:t>eje Z del offset lo lleva ahora al asiento. La prueba exige que el piloto quede</w:t>
+      </w:r>
+    </w:p>
+    <w:p>
+      <w:r>
+        <w:t>centrado lateralmente (|dx| &lt; 0.5) y sobre la zona del asiento (0.3 ≤ dz ≤ 1.2).</w:t>
+      </w:r>
+    </w:p>
+    <w:p>
+      <w:r>
+        <w:drawing>
+          <wp:inline xmlns:a="http://schemas.openxmlformats.org/drawingml/2006/main" xmlns:pic="http://schemas.openxmlformats.org/drawingml/2006/picture">
+            <wp:extent cx="5486400" cy="4114800"/>
+            <wp:docPr id="5" name="Picture 5"/>
+            <wp:cNvGraphicFramePr>
+              <a:graphicFrameLocks noChangeAspect="1"/>
+            </wp:cNvGraphicFramePr>
+            <a:graphic>
+              <a:graphicData uri="http://schemas.openxmlformats.org/drawingml/2006/picture">
+                <pic:pic>
+                  <pic:nvPicPr>
+                    <pic:cNvPr id="0" name="lyra_kart_lado.png"/>
+                    <pic:cNvPicPr/>
+                  </pic:nvPicPr>
+                  <pic:blipFill>
+                    <a:blip r:embed="rId13"/>
+                    <a:stretch>
+                      <a:fillRect/>
+                    </a:stretch>
+                  </pic:blipFill>
+                  <pic:spPr>
+                    <a:xfrm>
+                      <a:off x="0" y="0"/>
+                      <a:ext cx="5486400" cy="4114800"/>
+                    </a:xfrm>
+                    <a:prstGeom prst="rect"/>
+                  </pic:spPr>
+                </pic:pic>
+              </a:graphicData>
+            </a:graphic>
+          </wp:inline>
+        </w:drawing>
+      </w:r>
+    </w:p>
+    <w:p>
+      <w:r>
+        <w:rPr>
+          <w:i/>
+          <w:sz w:val="18"/>
+        </w:rPr>
+        <w:t>Después — vista lateral de Lyra con el piloto sentado</w:t>
+      </w:r>
+    </w:p>
+    <w:p>
+      <w:r>
+        <w:drawing>
+          <wp:inline xmlns:a="http://schemas.openxmlformats.org/drawingml/2006/main" xmlns:pic="http://schemas.openxmlformats.org/drawingml/2006/picture">
+            <wp:extent cx="5486400" cy="4114800"/>
+            <wp:docPr id="6" name="Picture 6"/>
+            <wp:cNvGraphicFramePr>
+              <a:graphicFrameLocks noChangeAspect="1"/>
+            </wp:cNvGraphicFramePr>
+            <a:graphic>
+              <a:graphicData uri="http://schemas.openxmlformats.org/drawingml/2006/picture">
+                <pic:pic>
+                  <pic:nvPicPr>
+                    <pic:cNvPr id="0" name="karel_kart_lado.png"/>
+                    <pic:cNvPicPr/>
+                  </pic:nvPicPr>
+                  <pic:blipFill>
+                    <a:blip r:embed="rId14"/>
+                    <a:stretch>
+                      <a:fillRect/>
+                    </a:stretch>
+                  </pic:blipFill>
+                  <pic:spPr>
+                    <a:xfrm>
+                      <a:off x="0" y="0"/>
+                      <a:ext cx="5486400" cy="4114800"/>
+                    </a:xfrm>
+                    <a:prstGeom prst="rect"/>
+                  </pic:spPr>
+                </pic:pic>
+              </a:graphicData>
+            </a:graphic>
+          </wp:inline>
+        </w:drawing>
+      </w:r>
+    </w:p>
+    <w:p>
+      <w:r>
+        <w:rPr>
+          <w:i/>
+          <w:sz w:val="18"/>
+        </w:rPr>
+        <w:t>Después — vista lateral de Karel</w:t>
+      </w:r>
+    </w:p>
+    <w:p>
+      <w:r>
+        <w:drawing>
+          <wp:inline xmlns:a="http://schemas.openxmlformats.org/drawingml/2006/main" xmlns:pic="http://schemas.openxmlformats.org/drawingml/2006/picture">
+            <wp:extent cx="5486400" cy="4114800"/>
+            <wp:docPr id="7" name="Picture 7"/>
+            <wp:cNvGraphicFramePr>
+              <a:graphicFrameLocks noChangeAspect="1"/>
+            </wp:cNvGraphicFramePr>
+            <a:graphic>
+              <a:graphicData uri="http://schemas.openxmlformats.org/drawingml/2006/picture">
+                <pic:pic>
+                  <pic:nvPicPr>
+                    <pic:cNvPr id="0" name="vox_kart_lado.png"/>
+                    <pic:cNvPicPr/>
+                  </pic:nvPicPr>
+                  <pic:blipFill>
+                    <a:blip r:embed="rId15"/>
+                    <a:stretch>
+                      <a:fillRect/>
+                    </a:stretch>
+                  </pic:blipFill>
+                  <pic:spPr>
+                    <a:xfrm>
+                      <a:off x="0" y="0"/>
+                      <a:ext cx="5486400" cy="4114800"/>
+                    </a:xfrm>
+                    <a:prstGeom prst="rect"/>
+                  </pic:spPr>
+                </pic:pic>
+              </a:graphicData>
+            </a:graphic>
+          </wp:inline>
+        </w:drawing>
+      </w:r>
+    </w:p>
+    <w:p>
+      <w:r>
+        <w:rPr>
+          <w:i/>
+          <w:sz w:val="18"/>
+        </w:rPr>
+        <w:t>Después — vista lateral de Vox</w:t>
+      </w:r>
+    </w:p>
+    <w:p>
+      <w:r>
+        <w:drawing>
+          <wp:inline xmlns:a="http://schemas.openxmlformats.org/drawingml/2006/main" xmlns:pic="http://schemas.openxmlformats.org/drawingml/2006/picture">
+            <wp:extent cx="5486400" cy="3086100"/>
+            <wp:docPr id="8" name="Picture 8"/>
+            <wp:cNvGraphicFramePr>
+              <a:graphicFrameLocks noChangeAspect="1"/>
+            </wp:cNvGraphicFramePr>
+            <a:graphic>
+              <a:graphicData uri="http://schemas.openxmlformats.org/drawingml/2006/picture">
+                <pic:pic>
+                  <pic:nvPicPr>
+                    <pic:cNvPr id="0" name="seleccion_personajes.png"/>
+                    <pic:cNvPicPr/>
+                  </pic:nvPicPr>
+                  <pic:blipFill>
+                    <a:blip r:embed="rId16"/>
+                    <a:stretch>
+                      <a:fillRect/>
+                    </a:stretch>
+                  </pic:blipFill>
+                  <pic:spPr>
+                    <a:xfrm>
+                      <a:off x="0" y="0"/>
+                      <a:ext cx="5486400" cy="3086100"/>
+                    </a:xfrm>
+                    <a:prstGeom prst="rect"/>
+                  </pic:spPr>
+                </pic:pic>
+              </a:graphicData>
+            </a:graphic>
+          </wp:inline>
+        </w:drawing>
+      </w:r>
+    </w:p>
+    <w:p>
+      <w:r>
+        <w:rPr>
+          <w:i/>
+          <w:sz w:val="18"/>
+        </w:rPr>
+        <w:t>Después — selección de personajes con los tres pilotos en su kart</w:t>
+      </w:r>
+    </w:p>
+    <w:p>
+      <w:pPr>
+        <w:pStyle w:val="Heading3"/>
+      </w:pPr>
+      <w:r>
+        <w:t>3.2 Bot que cruza los huecos (defecto #2)</w:t>
+      </w:r>
+    </w:p>
+    <w:p>
+      <w:r>
+        <w:t>El bot lanzaba el rayo de "¿hay suelo?" justo debajo de sí mismo, de modo que solo</w:t>
+      </w:r>
+    </w:p>
+    <w:p>
+      <w:r>
+        <w:t>veía el vacío cuando ya estaba encima y no podía saltar. Además, su espera entre</w:t>
+      </w:r>
+    </w:p>
+    <w:p>
+      <w:r>
+        <w:t>saltos (0.8 s ≈ 16 m a 20 u/s) era mayor que una plataforma (≈ 8 m).</w:t>
+      </w:r>
+    </w:p>
+    <w:p>
+      <w:pPr>
+        <w:pStyle w:val="ListBullet"/>
+      </w:pPr>
+      <w:r>
+        <w:t xml:space="preserve">El rayo se lanza </w:t>
+      </w:r>
+      <w:r>
+        <w:rPr>
+          <w:b/>
+        </w:rPr>
+        <w:t>por delante</w:t>
+      </w:r>
+      <w:r>
+        <w:t xml:space="preserve">, a </w:t>
+      </w:r>
+      <w:r>
+        <w:rPr>
+          <w:rFonts w:ascii="Consolas" w:hAnsi="Consolas"/>
+        </w:rPr>
+        <w:t>velocidad × 0.16 s</w:t>
+      </w:r>
+      <w:r>
+        <w:t xml:space="preserve"> (entre 2.5 y 12 m).</w:t>
+      </w:r>
+    </w:p>
+    <w:p>
+      <w:pPr>
+        <w:pStyle w:val="ListBullet"/>
+      </w:pPr>
+      <w:r>
+        <w:t>El salto solo se pide si el kart está en el suelo.</w:t>
+      </w:r>
+    </w:p>
+    <w:p>
+      <w:pPr>
+        <w:pStyle w:val="ListBullet"/>
+      </w:pPr>
+      <w:r>
+        <w:t>La espera entre saltos baja a 0.25 s.</w:t>
+      </w:r>
+    </w:p>
+    <w:p>
+      <w:r>
+        <w:t xml:space="preserve">Resultado: en la sesión de captura inicial el bot reapareció </w:t>
+      </w:r>
+      <w:r>
+        <w:rPr>
+          <w:b/>
+        </w:rPr>
+        <w:t>74 veces</w:t>
+      </w:r>
+      <w:r>
+        <w:t xml:space="preserve"> (sesión</w:t>
+      </w:r>
+    </w:p>
+    <w:p>
+      <w:r>
+        <w:t xml:space="preserve">larga); tras el ajuste, </w:t>
+      </w:r>
+      <w:r>
+        <w:rPr>
+          <w:b/>
+        </w:rPr>
+        <w:t>3 veces</w:t>
+      </w:r>
+      <w:r>
+        <w:t xml:space="preserve"> en una sesión de 7 s de juego. La prueba</w:t>
+      </w:r>
+    </w:p>
+    <w:p>
+      <w:r>
+        <w:rPr>
+          <w:rFonts w:ascii="Consolas" w:hAnsi="Consolas"/>
+        </w:rPr>
+        <w:t>Bot_JumpsOverTrackGaps</w:t>
+      </w:r>
+      <w:r>
+        <w:t xml:space="preserve"> exige que cruce varias plataformas en 6 s (antes no</w:t>
+      </w:r>
+    </w:p>
+    <w:p>
+      <w:r>
+        <w:t>pasaba del primer hueco).</w:t>
+      </w:r>
+    </w:p>
+    <w:p>
+      <w:pPr>
+        <w:pStyle w:val="Heading3"/>
+      </w:pPr>
+      <w:r>
+        <w:t>3.3 HUD ampliado (P4)</w:t>
+      </w:r>
+    </w:p>
+    <w:p>
+      <w:r>
+        <w:t>Se añadieron al HUD de gameplay:</w:t>
+      </w:r>
+    </w:p>
+    <w:p>
+      <w:pPr>
+        <w:pStyle w:val="ListBullet"/>
+      </w:pPr>
+      <w:r>
+        <w:rPr>
+          <w:b/>
+        </w:rPr>
+        <w:t>Tiempo de carrera</w:t>
+      </w:r>
+      <w:r>
+        <w:t xml:space="preserve"> </w:t>
+      </w:r>
+      <w:r>
+        <w:rPr>
+          <w:rFonts w:ascii="Consolas" w:hAnsi="Consolas"/>
+        </w:rPr>
+        <w:t>mm:ss.cc</w:t>
+      </w:r>
+      <w:r>
+        <w:t xml:space="preserve"> (arriba al centro).</w:t>
+      </w:r>
+    </w:p>
+    <w:p>
+      <w:pPr>
+        <w:pStyle w:val="ListBullet"/>
+      </w:pPr>
+      <w:r>
+        <w:rPr>
+          <w:b/>
+        </w:rPr>
+        <w:t>Posición en pista</w:t>
+      </w:r>
+      <w:r>
+        <w:t xml:space="preserve"> "POSICIÓN 2/3" y distancia al villano "VOX A 115 m".</w:t>
+      </w:r>
+    </w:p>
+    <w:p>
+      <w:pPr>
+        <w:pStyle w:val="ListBullet"/>
+      </w:pPr>
+      <w:r>
+        <w:rPr>
+          <w:b/>
+        </w:rPr>
+        <w:t>Potenciadores</w:t>
+      </w:r>
+      <w:r>
+        <w:t>: "TURBO x1.6 3.0 s" y "RALENTIZADO −40 % 3.0 s" (abajo a la derecha).</w:t>
+      </w:r>
+    </w:p>
+    <w:p>
+      <w:pPr>
+        <w:pStyle w:val="ListBullet"/>
+      </w:pPr>
+      <w:r>
+        <w:rPr>
+          <w:b/>
+        </w:rPr>
+        <w:t>Vida de P1 y P2</w:t>
+      </w:r>
+      <w:r>
+        <w:t xml:space="preserve"> en modos con dos héroes.</w:t>
+      </w:r>
+    </w:p>
+    <w:p>
+      <w:r>
+        <w:drawing>
+          <wp:inline xmlns:a="http://schemas.openxmlformats.org/drawingml/2006/main" xmlns:pic="http://schemas.openxmlformats.org/drawingml/2006/picture">
+            <wp:extent cx="5486400" cy="3086100"/>
+            <wp:docPr id="9" name="Picture 9"/>
+            <wp:cNvGraphicFramePr>
+              <a:graphicFrameLocks noChangeAspect="1"/>
+            </wp:cNvGraphicFramePr>
+            <a:graphic>
+              <a:graphicData uri="http://schemas.openxmlformats.org/drawingml/2006/picture">
+                <pic:pic>
+                  <pic:nvPicPr>
+                    <pic:cNvPr id="0" name="gameplay_impacto_checkpoint_turbo.png"/>
+                    <pic:cNvPicPr/>
+                  </pic:nvPicPr>
+                  <pic:blipFill>
+                    <a:blip r:embed="rId17"/>
+                    <a:stretch>
+                      <a:fillRect/>
+                    </a:stretch>
+                  </pic:blipFill>
+                  <pic:spPr>
+                    <a:xfrm>
+                      <a:off x="0" y="0"/>
+                      <a:ext cx="5486400" cy="3086100"/>
+                    </a:xfrm>
+                    <a:prstGeom prst="rect"/>
+                  </pic:spPr>
+                </pic:pic>
+              </a:graphicData>
+            </a:graphic>
+          </wp:inline>
+        </w:drawing>
+      </w:r>
+    </w:p>
+    <w:p>
+      <w:r>
+        <w:rPr>
+          <w:i/>
+          <w:sz w:val="18"/>
+        </w:rPr>
+        <w:t>Después — HUD ampliado en gameplay (modo 1 Jugador + Bot)</w:t>
+      </w:r>
+    </w:p>
+    <w:p>
+      <w:pPr>
+        <w:pStyle w:val="Heading3"/>
+      </w:pPr>
+      <w:r>
+        <w:t>3.4 Progresión suavizada (P9)</w:t>
+      </w:r>
+    </w:p>
+    <w:p>
+      <w:r>
+        <w:rPr>
+          <w:rFonts w:ascii="Consolas" w:hAnsi="Consolas"/>
+        </w:rPr>
+        <w:t>ProceduralTrackBuilder</w:t>
+      </w:r>
+      <w:r>
+        <w:t xml:space="preserve"> aplica una rampa según la dificultad del dominio</w:t>
+      </w:r>
+    </w:p>
+    <w:p>
+      <w:r>
+        <w:t>(Percusalia = 1 … Void Crescendo = 7):</w:t>
+      </w:r>
+    </w:p>
+    <w:tbl>
+      <w:tblPr>
+        <w:tblStyle w:val="LightGrid-Accent1"/>
+        <w:tblW w:type="auto" w:w="0"/>
+        <w:tblLook w:firstColumn="1" w:firstRow="1" w:lastColumn="0" w:lastRow="0" w:noHBand="0" w:noVBand="1" w:val="04A0"/>
+      </w:tblPr>
+      <w:tblGrid>
+        <w:gridCol w:w="2880"/>
+        <w:gridCol w:w="2880"/>
+        <w:gridCol w:w="2880"/>
+      </w:tblGrid>
+      <w:tr>
+        <w:tc>
+          <w:tcPr>
+            <w:tcW w:type="dxa" w:w="2880"/>
+          </w:tcPr>
+          <w:p>
+            <w:r>
+              <w:rPr>
+                <w:b/>
+                <w:sz w:val="18"/>
+              </w:rPr>
+              <w:t>Parámetro</w:t>
+            </w:r>
+          </w:p>
+        </w:tc>
+        <w:tc>
+          <w:tcPr>
+            <w:tcW w:type="dxa" w:w="2880"/>
+          </w:tcPr>
+          <w:p>
+            <w:r>
+              <w:rPr>
+                <w:b/>
+                <w:sz w:val="18"/>
+              </w:rPr>
+              <w:t>Dominio 1</w:t>
+            </w:r>
+          </w:p>
+        </w:tc>
+        <w:tc>
+          <w:tcPr>
+            <w:tcW w:type="dxa" w:w="2880"/>
+          </w:tcPr>
+          <w:p>
+            <w:r>
+              <w:rPr>
+                <w:b/>
+                <w:sz w:val="18"/>
+              </w:rPr>
+              <w:t>Dominio 7</w:t>
+            </w:r>
+          </w:p>
+        </w:tc>
+      </w:tr>
+      <w:tr>
+        <w:tc>
+          <w:tcPr>
+            <w:tcW w:type="dxa" w:w="2880"/>
+          </w:tcPr>
+          <w:p>
+            <w:r>
+              <w:rPr>
+                <w:sz w:val="18"/>
+              </w:rPr>
+              <w:t>Escala de los huecos</w:t>
+            </w:r>
+          </w:p>
+        </w:tc>
+        <w:tc>
+          <w:tcPr>
+            <w:tcW w:type="dxa" w:w="2880"/>
+          </w:tcPr>
+          <w:p>
+            <w:r>
+              <w:rPr>
+                <w:sz w:val="18"/>
+              </w:rPr>
+              <w:t>×0.60</w:t>
+            </w:r>
+          </w:p>
+        </w:tc>
+        <w:tc>
+          <w:tcPr>
+            <w:tcW w:type="dxa" w:w="2880"/>
+          </w:tcPr>
+          <w:p>
+            <w:r>
+              <w:rPr>
+                <w:sz w:val="18"/>
+              </w:rPr>
+              <w:t>×1.00</w:t>
+            </w:r>
+          </w:p>
+        </w:tc>
+      </w:tr>
+      <w:tr>
+        <w:tc>
+          <w:tcPr>
+            <w:tcW w:type="dxa" w:w="2880"/>
+          </w:tcPr>
+          <w:p>
+            <w:r>
+              <w:rPr>
+                <w:sz w:val="18"/>
+              </w:rPr>
+              <w:t>Umbral de agudos para crear obstáculos</w:t>
+            </w:r>
+          </w:p>
+        </w:tc>
+        <w:tc>
+          <w:tcPr>
+            <w:tcW w:type="dxa" w:w="2880"/>
+          </w:tcPr>
+          <w:p>
+            <w:r>
+              <w:rPr>
+                <w:sz w:val="18"/>
+              </w:rPr>
+              <w:t>0.50</w:t>
+            </w:r>
+          </w:p>
+        </w:tc>
+        <w:tc>
+          <w:tcPr>
+            <w:tcW w:type="dxa" w:w="2880"/>
+          </w:tcPr>
+          <w:p>
+            <w:r>
+              <w:rPr>
+                <w:sz w:val="18"/>
+              </w:rPr>
+              <w:t>0.35</w:t>
+            </w:r>
+          </w:p>
+        </w:tc>
+      </w:tr>
+      <w:tr>
+        <w:tc>
+          <w:tcPr>
+            <w:tcW w:type="dxa" w:w="2880"/>
+          </w:tcPr>
+          <w:p>
+            <w:r>
+              <w:rPr>
+                <w:sz w:val="18"/>
+              </w:rPr>
+              <w:t>Tramos seguros al inicio (sin peligros, hueco ≤ 3 m)</w:t>
+            </w:r>
+          </w:p>
+        </w:tc>
+        <w:tc>
+          <w:tcPr>
+            <w:tcW w:type="dxa" w:w="2880"/>
+          </w:tcPr>
+          <w:p>
+            <w:r>
+              <w:rPr>
+                <w:sz w:val="18"/>
+              </w:rPr>
+              <w:t>3</w:t>
+            </w:r>
+          </w:p>
+        </w:tc>
+        <w:tc>
+          <w:tcPr>
+            <w:tcW w:type="dxa" w:w="2880"/>
+          </w:tcPr>
+          <w:p>
+            <w:r>
+              <w:rPr>
+                <w:sz w:val="18"/>
+              </w:rPr>
+              <w:t>1</w:t>
+            </w:r>
+          </w:p>
+        </w:tc>
+      </w:tr>
+    </w:tbl>
+    <w:p>
+      <w:pPr>
+        <w:pStyle w:val="Heading3"/>
+      </w:pPr>
+      <w:r>
+        <w:t>3.5 Checkpoints visibles (P9)</w:t>
+      </w:r>
+    </w:p>
+    <w:p>
+      <w:r>
+        <w:t xml:space="preserve">Cada checkpoint es ahora un arco neón que cruza toda la pista: </w:t>
+      </w:r>
+      <w:r>
+        <w:rPr>
+          <w:b/>
+        </w:rPr>
+        <w:t>ámbar</w:t>
+      </w:r>
+      <w:r>
+        <w:t xml:space="preserve"> mientras</w:t>
+      </w:r>
+    </w:p>
+    <w:p>
+      <w:r>
+        <w:t xml:space="preserve">está pendiente y </w:t>
+      </w:r>
+      <w:r>
+        <w:rPr>
+          <w:b/>
+        </w:rPr>
+        <w:t>verde</w:t>
+      </w:r>
+      <w:r>
+        <w:t xml:space="preserve"> cuando se alcanza. Al activarse, el HUD muestra</w:t>
+      </w:r>
+    </w:p>
+    <w:p>
+      <w:r>
+        <w:t>"CHECKPOINT" y suena un aviso. En los dominios 1 y 2 hay uno cada 2 plataformas</w:t>
+      </w:r>
+    </w:p>
+    <w:p>
+      <w:r>
+        <w:t>(antes cada 3).</w:t>
+      </w:r>
+    </w:p>
+    <w:p>
+      <w:pPr>
+        <w:pStyle w:val="Heading3"/>
+      </w:pPr>
+      <w:r>
+        <w:t>3.6 Retroalimentación de impacto (P6)</w:t>
+      </w:r>
+    </w:p>
+    <w:p>
+      <w:r>
+        <w:t>Al recibir un proyectil del villano:</w:t>
+      </w:r>
+    </w:p>
+    <w:p>
+      <w:pPr>
+        <w:pStyle w:val="ListBullet"/>
+      </w:pPr>
+      <w:r>
+        <w:rPr>
+          <w:b/>
+        </w:rPr>
+        <w:t>Visual:</w:t>
+      </w:r>
+      <w:r>
+        <w:t xml:space="preserve"> sacudida de cámara de 0.4 s, destello rojo (opacidad 0.55 → 0.70), aviso</w:t>
+      </w:r>
+    </w:p>
+    <w:p>
+      <w:r>
+        <w:t>central "IMPACTO! P1 −15 VIDA" y vida en rojo que vuelve al cian.</w:t>
+      </w:r>
+    </w:p>
+    <w:p>
+      <w:pPr>
+        <w:pStyle w:val="ListBullet"/>
+      </w:pPr>
+      <w:r>
+        <w:rPr>
+          <w:b/>
+        </w:rPr>
+        <w:t>Sonoro:</w:t>
+      </w:r>
+      <w:r>
+        <w:t xml:space="preserve"> sonido de impacto (golpe grave + chasquido + tono de alarma).</w:t>
+      </w:r>
+    </w:p>
+    <w:p>
+      <w:pPr>
+        <w:pStyle w:val="ListBullet"/>
+      </w:pPr>
+      <w:r>
+        <w:rPr>
+          <w:b/>
+        </w:rPr>
+        <w:t>Informativo:</w:t>
+      </w:r>
+      <w:r>
+        <w:t xml:space="preserve"> el potenciador "RALENTIZADO" aparece con su temporizador.</w:t>
+      </w:r>
+    </w:p>
+    <w:p>
+      <w:pPr>
+        <w:pStyle w:val="Heading3"/>
+      </w:pPr>
+      <w:r>
+        <w:t>3.7 Efectos de sonido (SFX)</w:t>
+      </w:r>
+    </w:p>
+    <w:p>
+      <w:r>
+        <w:t>Todos se sintetizan por código (sin archivos de audio), igual que la música, por lo</w:t>
+      </w:r>
+    </w:p>
+    <w:p>
+      <w:r>
+        <w:t>que funcionan también en WebGL y respetan el volumen de efectos de Opciones.</w:t>
+      </w:r>
+    </w:p>
+    <w:tbl>
+      <w:tblPr>
+        <w:tblStyle w:val="LightGrid-Accent1"/>
+        <w:tblW w:type="auto" w:w="0"/>
+        <w:tblLook w:firstColumn="1" w:firstRow="1" w:lastColumn="0" w:lastRow="0" w:noHBand="0" w:noVBand="1" w:val="04A0"/>
+      </w:tblPr>
+      <w:tblGrid>
+        <w:gridCol w:w="4320"/>
+        <w:gridCol w:w="4320"/>
+      </w:tblGrid>
+      <w:tr>
+        <w:tc>
+          <w:tcPr>
+            <w:tcW w:type="dxa" w:w="4320"/>
+          </w:tcPr>
+          <w:p>
+            <w:r>
+              <w:rPr>
+                <w:b/>
+                <w:sz w:val="18"/>
+              </w:rPr>
+              <w:t>Evento</w:t>
+            </w:r>
+          </w:p>
+        </w:tc>
+        <w:tc>
+          <w:tcPr>
+            <w:tcW w:type="dxa" w:w="4320"/>
+          </w:tcPr>
+          <w:p>
+            <w:r>
+              <w:rPr>
+                <w:b/>
+                <w:sz w:val="18"/>
+              </w:rPr>
+              <w:t>Efecto</w:t>
+            </w:r>
+          </w:p>
+        </w:tc>
+      </w:tr>
+      <w:tr>
+        <w:tc>
+          <w:tcPr>
+            <w:tcW w:type="dxa" w:w="4320"/>
+          </w:tcPr>
+          <w:p>
+            <w:r>
+              <w:rPr>
+                <w:sz w:val="18"/>
+              </w:rPr>
+              <w:t>Salto</w:t>
+            </w:r>
+          </w:p>
+        </w:tc>
+        <w:tc>
+          <w:tcPr>
+            <w:tcW w:type="dxa" w:w="4320"/>
+          </w:tcPr>
+          <w:p>
+            <w:r>
+              <w:rPr>
+                <w:sz w:val="18"/>
+              </w:rPr>
+              <w:t>Barrido ascendente corto</w:t>
+            </w:r>
+          </w:p>
+        </w:tc>
+      </w:tr>
+      <w:tr>
+        <w:tc>
+          <w:tcPr>
+            <w:tcW w:type="dxa" w:w="4320"/>
+          </w:tcPr>
+          <w:p>
+            <w:r>
+              <w:rPr>
+                <w:sz w:val="18"/>
+              </w:rPr>
+              <w:t>Turbo</w:t>
+            </w:r>
+          </w:p>
+        </w:tc>
+        <w:tc>
+          <w:tcPr>
+            <w:tcW w:type="dxa" w:w="4320"/>
+          </w:tcPr>
+          <w:p>
+            <w:r>
+              <w:rPr>
+                <w:sz w:val="18"/>
+              </w:rPr>
+              <w:t>Barrido con ruido y tono creciente</w:t>
+            </w:r>
+          </w:p>
+        </w:tc>
+      </w:tr>
+      <w:tr>
+        <w:tc>
+          <w:tcPr>
+            <w:tcW w:type="dxa" w:w="4320"/>
+          </w:tcPr>
+          <w:p>
+            <w:r>
+              <w:rPr>
+                <w:sz w:val="18"/>
+              </w:rPr>
+              <w:t>Checkpoint</w:t>
+            </w:r>
+          </w:p>
+        </w:tc>
+        <w:tc>
+          <w:tcPr>
+            <w:tcW w:type="dxa" w:w="4320"/>
+          </w:tcPr>
+          <w:p>
+            <w:r>
+              <w:rPr>
+                <w:sz w:val="18"/>
+              </w:rPr>
+              <w:t>Dos notas tipo campana</w:t>
+            </w:r>
+          </w:p>
+        </w:tc>
+      </w:tr>
+      <w:tr>
+        <w:tc>
+          <w:tcPr>
+            <w:tcW w:type="dxa" w:w="4320"/>
+          </w:tcPr>
+          <w:p>
+            <w:r>
+              <w:rPr>
+                <w:sz w:val="18"/>
+              </w:rPr>
+              <w:t>Disparo del villano</w:t>
+            </w:r>
+          </w:p>
+        </w:tc>
+        <w:tc>
+          <w:tcPr>
+            <w:tcW w:type="dxa" w:w="4320"/>
+          </w:tcPr>
+          <w:p>
+            <w:r>
+              <w:rPr>
+                <w:sz w:val="18"/>
+              </w:rPr>
+              <w:t>Barrido descendente</w:t>
+            </w:r>
+          </w:p>
+        </w:tc>
+      </w:tr>
+      <w:tr>
+        <w:tc>
+          <w:tcPr>
+            <w:tcW w:type="dxa" w:w="4320"/>
+          </w:tcPr>
+          <w:p>
+            <w:r>
+              <w:rPr>
+                <w:sz w:val="18"/>
+              </w:rPr>
+              <w:t>Meta del dominio</w:t>
+            </w:r>
+          </w:p>
+        </w:tc>
+        <w:tc>
+          <w:tcPr>
+            <w:tcW w:type="dxa" w:w="4320"/>
+          </w:tcPr>
+          <w:p>
+            <w:r>
+              <w:rPr>
+                <w:sz w:val="18"/>
+              </w:rPr>
+              <w:t>Arpegio de 4 notas</w:t>
+            </w:r>
+          </w:p>
+        </w:tc>
+      </w:tr>
+      <w:tr>
+        <w:tc>
+          <w:tcPr>
+            <w:tcW w:type="dxa" w:w="4320"/>
+          </w:tcPr>
+          <w:p>
+            <w:r>
+              <w:rPr>
+                <w:sz w:val="18"/>
+              </w:rPr>
+              <w:t>Hover de botones</w:t>
+            </w:r>
+          </w:p>
+        </w:tc>
+        <w:tc>
+          <w:tcPr>
+            <w:tcW w:type="dxa" w:w="4320"/>
+          </w:tcPr>
+          <w:p>
+            <w:r>
+              <w:rPr>
+                <w:sz w:val="18"/>
+              </w:rPr>
+              <w:t>Pulso breve</w:t>
+            </w:r>
+          </w:p>
+        </w:tc>
+      </w:tr>
+      <w:tr>
+        <w:tc>
+          <w:tcPr>
+            <w:tcW w:type="dxa" w:w="4320"/>
+          </w:tcPr>
+          <w:p>
+            <w:r>
+              <w:rPr>
+                <w:sz w:val="18"/>
+              </w:rPr>
+              <w:t>Motor</w:t>
+            </w:r>
+          </w:p>
+        </w:tc>
+        <w:tc>
+          <w:tcPr>
+            <w:tcW w:type="dxa" w:w="4320"/>
+          </w:tcPr>
+          <w:p>
+            <w:r>
+              <w:rPr>
+                <w:sz w:val="18"/>
+              </w:rPr>
+              <w:t>Bucle sin cortes cuyo tono sube con la velocidad (×0.7 → ×1.9)</w:t>
+            </w:r>
+          </w:p>
+        </w:tc>
+      </w:tr>
+    </w:tbl>
+    <w:p>
+      <w:pPr>
+        <w:pStyle w:val="Heading3"/>
+      </w:pPr>
+      <w:r>
+        <w:t>3.8 Tiempo en Resultados</w:t>
+      </w:r>
+    </w:p>
+    <w:p>
+      <w:r>
+        <w:t xml:space="preserve">El tiempo total se guarda en </w:t>
+      </w:r>
+      <w:r>
+        <w:rPr>
+          <w:rFonts w:ascii="Consolas" w:hAnsi="Consolas"/>
+        </w:rPr>
+        <w:t>GameSession.LastTime</w:t>
+      </w:r>
+      <w:r>
+        <w:t xml:space="preserve"> y se muestra en la pantalla de</w:t>
+      </w:r>
+    </w:p>
+    <w:p>
+      <w:r>
+        <w:t>resultados.</w:t>
+      </w:r>
+    </w:p>
+    <w:p>
+      <w:r>
+        <w:drawing>
+          <wp:inline xmlns:a="http://schemas.openxmlformats.org/drawingml/2006/main" xmlns:pic="http://schemas.openxmlformats.org/drawingml/2006/picture">
+            <wp:extent cx="5486400" cy="3086100"/>
+            <wp:docPr id="10" name="Picture 10"/>
+            <wp:cNvGraphicFramePr>
+              <a:graphicFrameLocks noChangeAspect="1"/>
+            </wp:cNvGraphicFramePr>
+            <a:graphic>
+              <a:graphicData uri="http://schemas.openxmlformats.org/drawingml/2006/picture">
+                <pic:pic>
+                  <pic:nvPicPr>
+                    <pic:cNvPr id="0" name="resultados_con_tiempo.png"/>
+                    <pic:cNvPicPr/>
+                  </pic:nvPicPr>
+                  <pic:blipFill>
+                    <a:blip r:embed="rId18"/>
+                    <a:stretch>
+                      <a:fillRect/>
+                    </a:stretch>
+                  </pic:blipFill>
+                  <pic:spPr>
+                    <a:xfrm>
+                      <a:off x="0" y="0"/>
+                      <a:ext cx="5486400" cy="3086100"/>
+                    </a:xfrm>
+                    <a:prstGeom prst="rect"/>
+                  </pic:spPr>
+                </pic:pic>
+              </a:graphicData>
+            </a:graphic>
+          </wp:inline>
+        </w:drawing>
+      </w:r>
+    </w:p>
+    <w:p>
+      <w:r>
+        <w:rPr>
+          <w:i/>
+          <w:sz w:val="18"/>
+        </w:rPr>
+        <w:t>Después — pantalla de resultados con tiempo total</w:t>
+      </w:r>
+    </w:p>
+    <w:p>
+      <w:pPr>
+        <w:pStyle w:val="Heading2"/>
+      </w:pPr>
+      <w:r>
+        <w:t>4. Implementación en Modo Editor</w:t>
+      </w:r>
+    </w:p>
+    <w:p>
+      <w:r>
+        <w:t xml:space="preserve">Los ajustes están en los scripts de </w:t>
       </w:r>
       <w:r>
         <w:rPr>
@@ -698,18 +2768,596 @@
         <w:t>Assets/Scripts</w:t>
       </w:r>
       <w:r>
-        <w:t xml:space="preserve"> y se refleja en las</w:t>
+        <w:t xml:space="preserve"> y en el archivo de datos</w:t>
       </w:r>
     </w:p>
     <w:p>
       <w:r>
-        <w:t xml:space="preserve">escenas generadas por </w:t>
+        <w:rPr>
+          <w:rFonts w:ascii="Consolas" w:hAnsi="Consolas"/>
+        </w:rPr>
+        <w:t>Assets/Resources/NitroRhythm/prototype_data.json</w:t>
+      </w:r>
+      <w:r>
+        <w:t>. El HUD, los checkpoints y los</w:t>
+      </w:r>
+    </w:p>
+    <w:p>
+      <w:r>
+        <w:t>SFX se construyen en tiempo de ejecución, por lo que **las 4 escenas se regeneran</w:t>
+      </w:r>
+    </w:p>
+    <w:p>
+      <w:r>
+        <w:t>sin cambios de estructura</w:t>
       </w:r>
       <w:r>
         <w:rPr>
           <w:b/>
         </w:rPr>
-        <w:t>NitroRhythm ▸ Build Prototype Scenes</w:t>
+        <w:t xml:space="preserve"> con </w:t>
+      </w:r>
+      <w:r>
+        <w:t>NitroRhythm ▸ Build Prototype Scenes**; los</w:t>
+      </w:r>
+    </w:p>
+    <w:p>
+      <w:r>
+        <w:t xml:space="preserve">archivos </w:t>
+      </w:r>
+      <w:r>
+        <w:rPr>
+          <w:rFonts w:ascii="Consolas" w:hAnsi="Consolas"/>
+        </w:rPr>
+        <w:t>.unity</w:t>
+      </w:r>
+      <w:r>
+        <w:t xml:space="preserve"> conservan la misma jerarquía y cargan los scripts actualizados.</w:t>
+      </w:r>
+    </w:p>
+    <w:p>
+      <w:pPr>
+        <w:pStyle w:val="Heading2"/>
+      </w:pPr>
+      <w:r>
+        <w:t>5. Verificación en Modo Play</w:t>
+      </w:r>
+    </w:p>
+    <w:p>
+      <w:r>
+        <w:t>Verificación automática (Unity Test Framework):</w:t>
+      </w:r>
+    </w:p>
+    <w:tbl>
+      <w:tblPr>
+        <w:tblStyle w:val="LightGrid-Accent1"/>
+        <w:tblW w:type="auto" w:w="0"/>
+        <w:tblLook w:firstColumn="1" w:firstRow="1" w:lastColumn="0" w:lastRow="0" w:noHBand="0" w:noVBand="1" w:val="04A0"/>
+      </w:tblPr>
+      <w:tblGrid>
+        <w:gridCol w:w="2880"/>
+        <w:gridCol w:w="2880"/>
+        <w:gridCol w:w="2880"/>
+      </w:tblGrid>
+      <w:tr>
+        <w:tc>
+          <w:tcPr>
+            <w:tcW w:type="dxa" w:w="2880"/>
+          </w:tcPr>
+          <w:p>
+            <w:r>
+              <w:rPr>
+                <w:b/>
+                <w:sz w:val="18"/>
+              </w:rPr>
+              <w:t>Conjunto</w:t>
+            </w:r>
+          </w:p>
+        </w:tc>
+        <w:tc>
+          <w:tcPr>
+            <w:tcW w:type="dxa" w:w="2880"/>
+          </w:tcPr>
+          <w:p>
+            <w:r>
+              <w:rPr>
+                <w:b/>
+                <w:sz w:val="18"/>
+              </w:rPr>
+              <w:t>Pruebas</w:t>
+            </w:r>
+          </w:p>
+        </w:tc>
+        <w:tc>
+          <w:tcPr>
+            <w:tcW w:type="dxa" w:w="2880"/>
+          </w:tcPr>
+          <w:p>
+            <w:r>
+              <w:rPr>
+                <w:b/>
+                <w:sz w:val="18"/>
+              </w:rPr>
+              <w:t>Resultado</w:t>
+            </w:r>
+          </w:p>
+        </w:tc>
+      </w:tr>
+      <w:tr>
+        <w:tc>
+          <w:tcPr>
+            <w:tcW w:type="dxa" w:w="2880"/>
+          </w:tcPr>
+          <w:p>
+            <w:r>
+              <w:rPr>
+                <w:sz w:val="18"/>
+              </w:rPr>
+              <w:t>PlayMode</w:t>
+            </w:r>
+          </w:p>
+        </w:tc>
+        <w:tc>
+          <w:tcPr>
+            <w:tcW w:type="dxa" w:w="2880"/>
+          </w:tcPr>
+          <w:p>
+            <w:r>
+              <w:rPr>
+                <w:sz w:val="18"/>
+              </w:rPr>
+              <w:t xml:space="preserve">21 + 2 generadores de capturas (solo corren con </w:t>
+            </w:r>
+            <w:r>
+              <w:rPr>
+                <w:rFonts w:ascii="Consolas" w:hAnsi="Consolas"/>
+                <w:sz w:val="18"/>
+              </w:rPr>
+              <w:t>NITRO_SHOT_DIR</w:t>
+            </w:r>
+            <w:r>
+              <w:rPr>
+                <w:sz w:val="18"/>
+              </w:rPr>
+              <w:t>)</w:t>
+            </w:r>
+          </w:p>
+        </w:tc>
+        <w:tc>
+          <w:tcPr>
+            <w:tcW w:type="dxa" w:w="2880"/>
+          </w:tcPr>
+          <w:p>
+            <w:r>
+              <w:rPr>
+                <w:sz w:val="18"/>
+              </w:rPr>
+              <w:t>ver sección 7</w:t>
+            </w:r>
+          </w:p>
+        </w:tc>
+      </w:tr>
+      <w:tr>
+        <w:tc>
+          <w:tcPr>
+            <w:tcW w:type="dxa" w:w="2880"/>
+          </w:tcPr>
+          <w:p>
+            <w:r>
+              <w:rPr>
+                <w:sz w:val="18"/>
+              </w:rPr>
+              <w:t>EditMode</w:t>
+            </w:r>
+          </w:p>
+        </w:tc>
+        <w:tc>
+          <w:tcPr>
+            <w:tcW w:type="dxa" w:w="2880"/>
+          </w:tcPr>
+          <w:p>
+            <w:r>
+              <w:rPr>
+                <w:sz w:val="18"/>
+              </w:rPr>
+              <w:t>4</w:t>
+            </w:r>
+          </w:p>
+        </w:tc>
+        <w:tc>
+          <w:tcPr>
+            <w:tcW w:type="dxa" w:w="2880"/>
+          </w:tcPr>
+          <w:p>
+            <w:r>
+              <w:rPr>
+                <w:sz w:val="18"/>
+              </w:rPr>
+              <w:t>ver sección 7</w:t>
+            </w:r>
+          </w:p>
+        </w:tc>
+      </w:tr>
+    </w:tbl>
+    <w:p>
+      <w:r>
+        <w:t>Pruebas nuevas de esta ronda: alineación del piloto de los 3 personajes, formato</w:t>
+      </w:r>
+    </w:p>
+    <w:p>
+      <w:r>
+        <w:t>del tiempo, cálculo de posición, curva de dificultad, tramo seguro inicial,</w:t>
+      </w:r>
+    </w:p>
+    <w:p>
+      <w:r>
+        <w:t>checkpoint (evento y solo hacia adelante), evento de impacto y temporizador de</w:t>
+      </w:r>
+    </w:p>
+    <w:p>
+      <w:r>
+        <w:t>ralentización, temporizador de turbo, los 8 sonidos (sintetizados y audibles),</w:t>
+      </w:r>
+    </w:p>
+    <w:p>
+      <w:r>
+        <w:t>sacudida de cámara y bot sobre la pista real.</w:t>
+      </w:r>
+    </w:p>
+    <w:p>
+      <w:r>
+        <w:t>Comprobación visual: las capturas de la sección 6 se generan jugando la escena</w:t>
+      </w:r>
+    </w:p>
+    <w:p>
+      <w:r>
+        <w:t xml:space="preserve">real </w:t>
+      </w:r>
+      <w:r>
+        <w:rPr>
+          <w:rFonts w:ascii="Consolas" w:hAnsi="Consolas"/>
+        </w:rPr>
+        <w:t>02_Gameplay</w:t>
+      </w:r>
+      <w:r>
+        <w:t xml:space="preserve"> (no son maquetas).</w:t>
+      </w:r>
+    </w:p>
+    <w:p>
+      <w:pPr>
+        <w:pStyle w:val="Heading2"/>
+      </w:pPr>
+      <w:r>
+        <w:t>6. Captura del estado final (Después)</w:t>
+      </w:r>
+    </w:p>
+    <w:tbl>
+      <w:tblPr>
+        <w:tblStyle w:val="LightGrid-Accent1"/>
+        <w:tblW w:type="auto" w:w="0"/>
+        <w:tblLook w:firstColumn="1" w:firstRow="1" w:lastColumn="0" w:lastRow="0" w:noHBand="0" w:noVBand="1" w:val="04A0"/>
+      </w:tblPr>
+      <w:tblGrid>
+        <w:gridCol w:w="2880"/>
+        <w:gridCol w:w="2880"/>
+        <w:gridCol w:w="2880"/>
+      </w:tblGrid>
+      <w:tr>
+        <w:tc>
+          <w:tcPr>
+            <w:tcW w:type="dxa" w:w="2880"/>
+          </w:tcPr>
+          <w:p>
+            <w:r>
+              <w:rPr>
+                <w:b/>
+                <w:sz w:val="18"/>
+              </w:rPr>
+              <w:t>Escena / aspecto</w:t>
+            </w:r>
+          </w:p>
+        </w:tc>
+        <w:tc>
+          <w:tcPr>
+            <w:tcW w:type="dxa" w:w="2880"/>
+          </w:tcPr>
+          <w:p>
+            <w:r>
+              <w:rPr>
+                <w:b/>
+                <w:sz w:val="18"/>
+              </w:rPr>
+              <w:t>Antes</w:t>
+            </w:r>
+          </w:p>
+        </w:tc>
+        <w:tc>
+          <w:tcPr>
+            <w:tcW w:type="dxa" w:w="2880"/>
+          </w:tcPr>
+          <w:p>
+            <w:r>
+              <w:rPr>
+                <w:b/>
+                <w:sz w:val="18"/>
+              </w:rPr>
+              <w:t>Después</w:t>
+            </w:r>
+          </w:p>
+        </w:tc>
+      </w:tr>
+      <w:tr>
+        <w:tc>
+          <w:tcPr>
+            <w:tcW w:type="dxa" w:w="2880"/>
+          </w:tcPr>
+          <w:p>
+            <w:r>
+              <w:rPr>
+                <w:sz w:val="18"/>
+              </w:rPr>
+              <w:t>Selección de personajes</w:t>
+            </w:r>
+          </w:p>
+        </w:tc>
+        <w:tc>
+          <w:tcPr>
+            <w:tcW w:type="dxa" w:w="2880"/>
+          </w:tcPr>
+          <w:p>
+            <w:r>
+              <w:rPr>
+                <w:rFonts w:ascii="Consolas" w:hAnsi="Consolas"/>
+                <w:sz w:val="18"/>
+              </w:rPr>
+              <w:t>Capturas/Antes/02_CharacterSelect_original.png</w:t>
+            </w:r>
+          </w:p>
+        </w:tc>
+        <w:tc>
+          <w:tcPr>
+            <w:tcW w:type="dxa" w:w="2880"/>
+          </w:tcPr>
+          <w:p>
+            <w:r>
+              <w:rPr>
+                <w:rFonts w:ascii="Consolas" w:hAnsi="Consolas"/>
+                <w:sz w:val="18"/>
+              </w:rPr>
+              <w:t>Capturas/Despues/gameplay/seleccion_personajes.png</w:t>
+            </w:r>
+          </w:p>
+        </w:tc>
+      </w:tr>
+      <w:tr>
+        <w:tc>
+          <w:tcPr>
+            <w:tcW w:type="dxa" w:w="2880"/>
+          </w:tcPr>
+          <w:p>
+            <w:r>
+              <w:rPr>
+                <w:sz w:val="18"/>
+              </w:rPr>
+              <w:t>Gameplay / HUD</w:t>
+            </w:r>
+          </w:p>
+        </w:tc>
+        <w:tc>
+          <w:tcPr>
+            <w:tcW w:type="dxa" w:w="2880"/>
+          </w:tcPr>
+          <w:p>
+            <w:r>
+              <w:rPr>
+                <w:rFonts w:ascii="Consolas" w:hAnsi="Consolas"/>
+                <w:sz w:val="18"/>
+              </w:rPr>
+              <w:t>Capturas/Antes/03_Gameplay_HUD_original.png</w:t>
+            </w:r>
+          </w:p>
+        </w:tc>
+        <w:tc>
+          <w:tcPr>
+            <w:tcW w:type="dxa" w:w="2880"/>
+          </w:tcPr>
+          <w:p>
+            <w:r>
+              <w:rPr>
+                <w:rFonts w:ascii="Consolas" w:hAnsi="Consolas"/>
+                <w:sz w:val="18"/>
+              </w:rPr>
+              <w:t>Capturas/Despues/gameplay/gameplay_impacto_checkpoint_turbo.png</w:t>
+            </w:r>
+            <w:r>
+              <w:rPr>
+                <w:sz w:val="18"/>
+              </w:rPr>
+              <w:t xml:space="preserve"> y </w:t>
+            </w:r>
+            <w:r>
+              <w:rPr>
+                <w:rFonts w:ascii="Consolas" w:hAnsi="Consolas"/>
+                <w:sz w:val="18"/>
+              </w:rPr>
+              <w:t>gameplay_conduciendo.png</w:t>
+            </w:r>
+          </w:p>
+        </w:tc>
+      </w:tr>
+      <w:tr>
+        <w:tc>
+          <w:tcPr>
+            <w:tcW w:type="dxa" w:w="2880"/>
+          </w:tcPr>
+          <w:p>
+            <w:r>
+              <w:rPr>
+                <w:sz w:val="18"/>
+              </w:rPr>
+              <w:t>Resultados</w:t>
+            </w:r>
+          </w:p>
+        </w:tc>
+        <w:tc>
+          <w:tcPr>
+            <w:tcW w:type="dxa" w:w="2880"/>
+          </w:tcPr>
+          <w:p>
+            <w:r>
+              <w:rPr>
+                <w:sz w:val="18"/>
+              </w:rPr>
+              <w:t>— (sin tiempo)</w:t>
+            </w:r>
+          </w:p>
+        </w:tc>
+        <w:tc>
+          <w:tcPr>
+            <w:tcW w:type="dxa" w:w="2880"/>
+          </w:tcPr>
+          <w:p>
+            <w:r>
+              <w:rPr>
+                <w:rFonts w:ascii="Consolas" w:hAnsi="Consolas"/>
+                <w:sz w:val="18"/>
+              </w:rPr>
+              <w:t>Capturas/Despues/gameplay/resultados_con_tiempo.png</w:t>
+            </w:r>
+          </w:p>
+        </w:tc>
+      </w:tr>
+      <w:tr>
+        <w:tc>
+          <w:tcPr>
+            <w:tcW w:type="dxa" w:w="2880"/>
+          </w:tcPr>
+          <w:p>
+            <w:r>
+              <w:rPr>
+                <w:sz w:val="18"/>
+              </w:rPr>
+              <w:t>Piloto de Lyra / Karel / Vox</w:t>
+            </w:r>
+          </w:p>
+        </w:tc>
+        <w:tc>
+          <w:tcPr>
+            <w:tcW w:type="dxa" w:w="2880"/>
+          </w:tcPr>
+          <w:p>
+            <w:r>
+              <w:rPr>
+                <w:rFonts w:ascii="Consolas" w:hAnsi="Consolas"/>
+                <w:sz w:val="18"/>
+              </w:rPr>
+              <w:t>Capturas/Antes/piloto/*.png</w:t>
+            </w:r>
+          </w:p>
+        </w:tc>
+        <w:tc>
+          <w:tcPr>
+            <w:tcW w:type="dxa" w:w="2880"/>
+          </w:tcPr>
+          <w:p>
+            <w:r>
+              <w:rPr>
+                <w:rFonts w:ascii="Consolas" w:hAnsi="Consolas"/>
+                <w:sz w:val="18"/>
+              </w:rPr>
+              <w:t>Capturas/Despues/piloto/*.png</w:t>
+            </w:r>
+          </w:p>
+        </w:tc>
+      </w:tr>
+    </w:tbl>
+    <w:p>
+      <w:r>
+        <w:drawing>
+          <wp:inline xmlns:a="http://schemas.openxmlformats.org/drawingml/2006/main" xmlns:pic="http://schemas.openxmlformats.org/drawingml/2006/picture">
+            <wp:extent cx="5486400" cy="3086100"/>
+            <wp:docPr id="11" name="Picture 11"/>
+            <wp:cNvGraphicFramePr>
+              <a:graphicFrameLocks noChangeAspect="1"/>
+            </wp:cNvGraphicFramePr>
+            <a:graphic>
+              <a:graphicData uri="http://schemas.openxmlformats.org/drawingml/2006/picture">
+                <pic:pic>
+                  <pic:nvPicPr>
+                    <pic:cNvPr id="0" name="gameplay_conduciendo.png"/>
+                    <pic:cNvPicPr/>
+                  </pic:nvPicPr>
+                  <pic:blipFill>
+                    <a:blip r:embed="rId19"/>
+                    <a:stretch>
+                      <a:fillRect/>
+                    </a:stretch>
+                  </pic:blipFill>
+                  <pic:spPr>
+                    <a:xfrm>
+                      <a:off x="0" y="0"/>
+                      <a:ext cx="5486400" cy="3086100"/>
+                    </a:xfrm>
+                    <a:prstGeom prst="rect"/>
+                  </pic:spPr>
+                </pic:pic>
+              </a:graphicData>
+            </a:graphic>
+          </wp:inline>
+        </w:drawing>
+      </w:r>
+    </w:p>
+    <w:p>
+      <w:r>
+        <w:rPr>
+          <w:i/>
+          <w:sz w:val="18"/>
+        </w:rPr>
+        <w:t>Después — gameplay conduciendo con el HUD ampliado</w:t>
+      </w:r>
+    </w:p>
+    <w:p>
+      <w:r>
+        <w:t>Capturas del estado anterior ya existentes (menú principal y pausa) siguen vigentes en</w:t>
+      </w:r>
+    </w:p>
+    <w:p>
+      <w:r>
+        <w:rPr>
+          <w:rFonts w:ascii="Consolas" w:hAnsi="Consolas"/>
+        </w:rPr>
+        <w:t>Capturas/Despues/01_MainMenu.png</w:t>
+      </w:r>
+      <w:r>
+        <w:t xml:space="preserve"> y </w:t>
+      </w:r>
+      <w:r>
+        <w:rPr>
+          <w:rFonts w:ascii="Consolas" w:hAnsi="Consolas"/>
+        </w:rPr>
+        <w:t>04_Pause.png</w:t>
+      </w:r>
+      <w:r>
+        <w:t>: esas escenas no cambiaron.</w:t>
+      </w:r>
+    </w:p>
+    <w:p>
+      <w:pPr>
+        <w:pStyle w:val="Heading2"/>
+      </w:pPr>
+      <w:r>
+        <w:t>7. Resultado de la verificación</w:t>
+      </w:r>
+    </w:p>
+    <w:p>
+      <w:r>
+        <w:t xml:space="preserve">Ver el resumen final en </w:t>
+      </w:r>
+      <w:r>
+        <w:rPr>
+          <w:rFonts w:ascii="Consolas" w:hAnsi="Consolas"/>
+        </w:rPr>
+        <w:t>Docs/Evidencias/RESULTADO_PRUEBAS.md</w:t>
       </w:r>
       <w:r>
         <w:t>.</w:t>
@@ -720,176 +3368,48 @@
         <w:pStyle w:val="Heading2"/>
       </w:pPr>
       <w:r>
-        <w:t>4. Verificación en Modo Play</w:t>
-      </w:r>
-    </w:p>
-    <w:p>
-      <w:pPr>
-        <w:pStyle w:val="ListNumber"/>
-      </w:pPr>
-      <w:r>
-        <w:t xml:space="preserve">Abra </w:t>
-      </w:r>
-      <w:r>
-        <w:rPr>
-          <w:rFonts w:ascii="Consolas" w:hAnsi="Consolas"/>
-        </w:rPr>
-        <w:t>02_Gameplay</w:t>
-      </w:r>
-      <w:r>
-        <w:t xml:space="preserve">, pulse </w:t>
-      </w:r>
-      <w:r>
-        <w:rPr>
-          <w:b/>
-        </w:rPr>
-        <w:t>Play</w:t>
-      </w:r>
-      <w:r>
-        <w:t xml:space="preserve"> y verifique: movimiento, salto, pista</w:t>
-      </w:r>
-    </w:p>
-    <w:p>
-      <w:r>
-        <w:t>reactiva, disparo del villano y HUD.</w:t>
-      </w:r>
-    </w:p>
-    <w:p>
-      <w:pPr>
-        <w:pStyle w:val="ListNumber"/>
-      </w:pPr>
-      <w:r>
-        <w:t xml:space="preserve">Pulse </w:t>
-      </w:r>
-      <w:r>
-        <w:rPr>
-          <w:rFonts w:ascii="Consolas" w:hAnsi="Consolas"/>
-        </w:rPr>
-        <w:t>Escape</w:t>
-      </w:r>
-      <w:r>
-        <w:t xml:space="preserve"> para verificar la pausa.</w:t>
-      </w:r>
-    </w:p>
-    <w:p>
-      <w:pPr>
-        <w:pStyle w:val="ListNumber"/>
-      </w:pPr>
-      <w:r>
-        <w:t>Complete un nivel para verificar la cutscene y el paso a Resultados.</w:t>
-      </w:r>
-    </w:p>
-    <w:p>
-      <w:pPr>
-        <w:pStyle w:val="Heading2"/>
-      </w:pPr>
-      <w:r>
-        <w:t>5. Captura del estado final (Después)</w:t>
-      </w:r>
-    </w:p>
-    <w:p>
-      <w:pPr>
-        <w:pStyle w:val="ListNumber"/>
-      </w:pPr>
-      <w:r>
-        <w:rPr>
-          <w:b/>
-        </w:rPr>
-        <w:t>Evidence Capture Tool</w:t>
-      </w:r>
-      <w:r>
-        <w:t xml:space="preserve"> → carpeta </w:t>
-      </w:r>
-      <w:r>
-        <w:rPr>
-          <w:rFonts w:ascii="Consolas" w:hAnsi="Consolas"/>
-        </w:rPr>
-        <w:t>Despues</w:t>
-      </w:r>
-      <w:r>
-        <w:t>.</w:t>
-      </w:r>
-    </w:p>
-    <w:p>
-      <w:pPr>
-        <w:pStyle w:val="ListNumber"/>
-      </w:pPr>
-      <w:r>
-        <w:t>Capture las 4 escenas en Play.</w:t>
-      </w:r>
-    </w:p>
-    <w:p>
-      <w:pPr>
-        <w:pStyle w:val="ListNumber"/>
-      </w:pPr>
-      <w:r>
-        <w:t xml:space="preserve">Compare con las capturas de </w:t>
-      </w:r>
-      <w:r>
-        <w:rPr>
-          <w:rFonts w:ascii="Consolas" w:hAnsi="Consolas"/>
-        </w:rPr>
-        <w:t>Antes</w:t>
-      </w:r>
-      <w:r>
-        <w:t>.</w:t>
-      </w:r>
-    </w:p>
-    <w:p>
-      <w:pPr>
-        <w:pStyle w:val="Heading2"/>
-      </w:pPr>
-      <w:r>
-        <w:t>6. Carpeta de entrega</w:t>
+        <w:t>8. Carpeta de entrega</w:t>
       </w:r>
     </w:p>
     <w:p>
       <w:r>
         <w:rPr>
           <w:rFonts w:ascii="Consolas" w:hAnsi="Consolas"/>
+          <w:sz w:val="18"/>
         </w:rPr>
-        <w:t>`</w:t>
-      </w:r>
-    </w:p>
-    <w:p>
-      <w:r>
-        <w:t>Evidencias/</w:t>
-      </w:r>
-    </w:p>
-    <w:p>
-      <w:r>
-        <w:t>Antes/    (capturas del estado inicial)</w:t>
-      </w:r>
-    </w:p>
-    <w:p>
-      <w:r>
-        <w:t>Despues/  (capturas del estado ajustado)</w:t>
+        <w:t>Assets/Scenes/        00_MainMenu · 01_CharacterSelect · 02_Gameplay · 03_Results  (4 archivos Unity)</w:t>
       </w:r>
     </w:p>
     <w:p>
       <w:r>
         <w:rPr>
           <w:rFonts w:ascii="Consolas" w:hAnsi="Consolas"/>
+          <w:sz w:val="18"/>
         </w:rPr>
-        <w:t>`</w:t>
+        <w:t>Docs/Capturas/Antes/  capturas del estado inicial</w:t>
       </w:r>
     </w:p>
     <w:p>
       <w:r>
         <w:rPr>
-          <w:i/>
-          <w:color w:val="555555"/>
+          <w:rFonts w:ascii="Consolas" w:hAnsi="Consolas"/>
+          <w:sz w:val="18"/>
         </w:rPr>
-        <w:t>Entregue máximo 4 archivos Unity (las 4 escenas ajustadas) junto con esta</w:t>
+        <w:t>Docs/Capturas/Despues/ capturas del estado ajustado</w:t>
       </w:r>
     </w:p>
     <w:p>
       <w:r>
+        <w:t xml:space="preserve">Enlaces exactos de cada entrega: </w:t>
+      </w:r>
+      <w:r>
         <w:rPr>
-          <w:i/>
-          <w:color w:val="555555"/>
+          <w:rFonts w:ascii="Consolas" w:hAnsi="Consolas"/>
         </w:rPr>
-        <w:t>carpeta de capturas.</w:t>
+        <w:t>Docs/Evidencias/ENLACES_EVIDENCIAS.md</w:t>
+      </w:r>
+      <w:r>
+        <w:t>.</w:t>
       </w:r>
     </w:p>
     <w:sectPr>

</xml_diff>

<commit_message>
fix: capturas 'antes' simuladas (proto de cubos) y infografia AA4 con pares antes/despues correctos
</commit_message>
<xml_diff>
--- a/Docs/Evidencias/GA5-AA3-EV01_Registro_Cambios.docx
+++ b/Docs/Evidencias/GA5-AA3-EV01_Registro_Cambios.docx
@@ -164,7 +164,7 @@
       <w:r>
         <w:drawing>
           <wp:inline xmlns:a="http://schemas.openxmlformats.org/drawingml/2006/main" xmlns:pic="http://schemas.openxmlformats.org/drawingml/2006/picture">
-            <wp:extent cx="5486400" cy="3429000"/>
+            <wp:extent cx="5486400" cy="3086100"/>
             <wp:docPr id="1" name="Picture 1"/>
             <wp:cNvGraphicFramePr>
               <a:graphicFrameLocks noChangeAspect="1"/>
@@ -185,7 +185,7 @@
                   <pic:spPr>
                     <a:xfrm>
                       <a:off x="0" y="0"/>
-                      <a:ext cx="5486400" cy="3429000"/>
+                      <a:ext cx="5486400" cy="3086100"/>
                     </a:xfrm>
                     <a:prstGeom prst="rect"/>
                   </pic:spPr>
@@ -209,7 +209,7 @@
       <w:r>
         <w:drawing>
           <wp:inline xmlns:a="http://schemas.openxmlformats.org/drawingml/2006/main" xmlns:pic="http://schemas.openxmlformats.org/drawingml/2006/picture">
-            <wp:extent cx="5486400" cy="3429000"/>
+            <wp:extent cx="5486400" cy="3086100"/>
             <wp:docPr id="2" name="Picture 2"/>
             <wp:cNvGraphicFramePr>
               <a:graphicFrameLocks noChangeAspect="1"/>
@@ -230,7 +230,7 @@
                   <pic:spPr>
                     <a:xfrm>
                       <a:off x="0" y="0"/>
-                      <a:ext cx="5486400" cy="3429000"/>
+                      <a:ext cx="5486400" cy="3086100"/>
                     </a:xfrm>
                     <a:prstGeom prst="rect"/>
                   </pic:spPr>

</xml_diff>